<commit_message>
Pregunta A: composición por empresa del concentrado EUA-México
Espejo bilateral (México registra 5 % del concentrado que EUA declara exportarle
en 2011-2017 y 43 % en 2018-2024), transacciones Southern Copper-Asarco de los
10-K 2015-2025 y documentación de la ruta por Guaymas. Sección 3.7, Cuadro 6 e
Ilustración 3 en el escrito independiente; se matiza la «inversión» del flujo.

Co-Authored-By: Claude Opus 5.5 <noreply@anthropic.com>
</commit_message>
<xml_diff>
--- a/ICR/11 Redaccion/Escritos independientes/Mexico y el abasto de cobre de Estados Unidos, 1992-2024.docx
+++ b/ICR/11 Redaccion/Escritos independientes/Mexico y el abasto de cobre de Estados Unidos, 1992-2024.docx
@@ -83,7 +83,7 @@
         <w:rPr>
           <w:lang w:val="es-ES"/>
         </w:rPr>
-        <w:t xml:space="preserve">(1994-2022). El consumo aparente de cobre de Estados Unidos pasó de alrededor de 3 000 miles de toneladas a fines de los noventa a entre 1 660 y 1 970 miles en 2009-2024; de siete fundiciones primarias en operación en 1998 quedaban dos en 2025, y desde 2005 el país exporta más concentrado del que importa. El cobre refinado que importa proviene sobre todo de Chile. México tiene una participación variable en el refinado (2 % del valor en 2024), creciente en la chatarra (41 %) y es, desde 2013, el destino principal del concentrado que exporta Estados Unidos.</w:t>
+        <w:t xml:space="preserve">(1994-2022). El consumo aparente de cobre de Estados Unidos pasó de alrededor de 3 000 miles de toneladas a fines de los noventa a entre 1 660 y 1 970 miles en 2009-2024; de siete fundiciones primarias en operación en 1998 quedaban dos en 2025, y desde 2005 el país exporta más concentrado del que importa. El cobre refinado que importa proviene sobre todo de Chile. México tiene una participación variable en el refinado (2 % del valor en 2024), creciente en la chatarra (41 %) y es, según el registro estadounidense, el destino principal del concentrado que exporta Estados Unidos desde 2013. México registra como importación solo 5 % de ese concentrado en 2011-2017 y 43 % en 2018-2024; documentos de empresas mineras de Arizona describen el paso de su concentrado por el puerto de Guaymas, Sonora, hacia Asia.</w:t>
       </w:r>
     </w:p>
     <w:bookmarkStart w:id="9" w:name="pregunta"/>
@@ -300,6 +300,64 @@
           <w:lang w:val="es-ES"/>
         </w:rPr>
         <w:t xml:space="preserve">del USGS, ediciones 1994 a 2022 (U.S. Geological Survey, 1996-2025).</w:t>
+      </w:r>
+    </w:p>
+    <w:p>
+      <w:pPr>
+        <w:pStyle w:val="Compact"/>
+        <w:numPr>
+          <w:ilvl w:val="0"/>
+          <w:numId w:val="1001"/>
+        </w:numPr>
+      </w:pPr>
+      <w:r>
+        <w:rPr>
+          <w:b/>
+          <w:bCs/>
+          <w:lang w:val="es-ES"/>
+        </w:rPr>
+        <w:t xml:space="preserve">Importaciones de México.</w:t>
+      </w:r>
+      <w:r>
+        <w:rPr>
+          <w:lang w:val="es-ES"/>
+        </w:rPr>
+        <w:t xml:space="preserve"> </w:t>
+      </w:r>
+      <w:r>
+        <w:rPr>
+          <w:lang w:val="es-ES"/>
+        </w:rPr>
+        <w:t xml:space="preserve">UN Comtrade, con México como reportante, importaciones de las partidas 2603, 7402, 7403 y 7404 por país de origen, 1992-2024.</w:t>
+      </w:r>
+    </w:p>
+    <w:p>
+      <w:pPr>
+        <w:pStyle w:val="Compact"/>
+        <w:numPr>
+          <w:ilvl w:val="0"/>
+          <w:numId w:val="1001"/>
+        </w:numPr>
+      </w:pPr>
+      <w:r>
+        <w:rPr>
+          <w:b/>
+          <w:bCs/>
+          <w:lang w:val="es-ES"/>
+        </w:rPr>
+        <w:t xml:space="preserve">Informes de empresas.</w:t>
+      </w:r>
+      <w:r>
+        <w:rPr>
+          <w:lang w:val="es-ES"/>
+        </w:rPr>
+        <w:t xml:space="preserve"> </w:t>
+      </w:r>
+      <w:r>
+        <w:rPr>
+          <w:lang w:val="es-ES"/>
+        </w:rPr>
+        <w:t xml:space="preserve">La nota de operaciones con partes relacionadas de los informes anuales 10-K de Southern Copper Corporation, 2015-2025 (Southern Copper Corporation, 2016-2026), y el análisis de la administración de Mercator Minerals para 2011 (Mercator Minerals, 2012).</w:t>
       </w:r>
     </w:p>
     <w:bookmarkEnd w:id="10"/>
@@ -1972,7 +2030,7 @@
     </w:p>
     <w:bookmarkEnd w:id="11"/>
     <w:bookmarkEnd w:id="12"/>
-    <w:bookmarkStart w:id="25" w:name="resultados"/>
+    <w:bookmarkStart w:id="29" w:name="resultados"/>
     <w:p>
       <w:pPr>
         <w:pStyle w:val="Heading2"/>
@@ -4759,7 +4817,7 @@
         <w:rPr>
           <w:lang w:val="es-ES"/>
         </w:rPr>
-        <w:t xml:space="preserve">México es, desde 2013, el destino principal del concentrado que exporta Estados Unidos: entre 56 % y 81 % del valor en 2013-2024 según Comtrade (el máximo, en 2015), y entre 52 % y 68 % de la cantidad en 2016-2022 según el</w:t>
+        <w:t xml:space="preserve">Según el registro de Estados Unidos, México es desde 2013 el destino principal del concentrado que exporta ese país: entre 56 % y 81 % del valor en 2013-2024 según Comtrade (el máximo, en 2015), y entre 52 % y 68 % de la cantidad en 2016-2022 según el</w:t>
       </w:r>
       <w:r>
         <w:rPr>
@@ -4779,7 +4837,7 @@
         <w:rPr>
           <w:lang w:val="es-ES"/>
         </w:rPr>
-        <w:t xml:space="preserve">. México es también el destino principal del cobre refinado que exporta Estados Unidos (83 % del valor en 2024). En el concentrado, el flujo entre los dos países se invirtió respecto de los años noventa.</w:t>
+        <w:t xml:space="preserve">. México es también el destino principal del cobre refinado que exporta Estados Unidos (83 % del valor en 2024). En ese registro, el sentido del flujo de concentrado entre los dos países aparece invertido respecto de 1992-1995; la sección 3.7 muestra qué parte de él registra México como importación.</w:t>
       </w:r>
     </w:p>
     <w:bookmarkEnd w:id="23"/>
@@ -5434,8 +5492,1191 @@
       </w:r>
     </w:p>
     <w:bookmarkEnd w:id="24"/>
-    <w:bookmarkEnd w:id="25"/>
-    <w:bookmarkStart w:id="26" w:name="límites-de-los-datos"/>
+    <w:bookmarkStart w:id="28" w:name="X9049847ac3980c8d4e9f0bcb214b2ea872c8a4b"/>
+    <w:p>
+      <w:pPr>
+        <w:pStyle w:val="Heading3"/>
+      </w:pPr>
+      <w:r>
+        <w:rPr>
+          <w:lang w:val="es-ES"/>
+        </w:rPr>
+        <w:t xml:space="preserve">3.7 Composición por empresa y registro del destino</w:t>
+      </w:r>
+    </w:p>
+    <w:p>
+      <w:pPr>
+        <w:pStyle w:val="FirstParagraph"/>
+      </w:pPr>
+      <w:r>
+        <w:rPr>
+          <w:lang w:val="es-ES"/>
+        </w:rPr>
+        <w:t xml:space="preserve">El Cuadro 6 añade, al concentrado que Estados Unidos declara exportar a México, lo que México declara importar desde Estados Unidos y las compras de las operaciones mexicanas de Southern Copper Corporation, subsidiaria de Grupo México, a Asarco LLC, otra subsidiaria del mismo grupo, propietaria de las minas Mission y Ray en Arizona y de la fundición de Hayden. La Ilustración 3 muestra las tres series.</w:t>
+      </w:r>
+    </w:p>
+    <w:p>
+      <w:pPr>
+        <w:pStyle w:val="BodyText"/>
+      </w:pPr>
+      <w:r>
+        <w:rPr>
+          <w:b/>
+          <w:bCs/>
+          <w:lang w:val="es-ES"/>
+        </w:rPr>
+        <w:t xml:space="preserve">Cuadro 6.</w:t>
+      </w:r>
+      <w:r>
+        <w:rPr>
+          <w:lang w:val="es-ES"/>
+        </w:rPr>
+        <w:t xml:space="preserve"> </w:t>
+      </w:r>
+      <w:r>
+        <w:rPr>
+          <w:lang w:val="es-ES"/>
+        </w:rPr>
+        <w:t xml:space="preserve">Concentrado de cobre (2603) de Estados Unidos con destino México según cada registro, y compras de Southern Copper (operaciones en México) a Asarco, años seleccionados (millones de dólares)</w:t>
+      </w:r>
+    </w:p>
+    <w:tbl>
+      <w:tblPr>
+        <w:tblStyle w:val="Table"/>
+        <w:tblW w:type="pct" w:w="5000"/>
+        <w:tblLayout w:type="fixed"/>
+        <w:tblLook w:firstRow="1" w:lastRow="0" w:firstColumn="0" w:lastColumn="0" w:noHBand="0" w:noVBand="0" w:val="0020"/>
+      </w:tblPr>
+      <w:tblGrid>
+        <w:gridCol w:w="1250"/>
+        <w:gridCol w:w="1667"/>
+        <w:gridCol w:w="1667"/>
+        <w:gridCol w:w="1667"/>
+        <w:gridCol w:w="1667"/>
+      </w:tblGrid>
+      <w:tr>
+        <w:trPr>
+          <w:tblHeader w:val="on"/>
+        </w:trPr>
+        <w:tc>
+          <w:tcPr/>
+          <w:p>
+            <w:pPr>
+              <w:pStyle w:val="Compact"/>
+            </w:pPr>
+            <w:r>
+              <w:rPr>
+                <w:lang w:val="es-ES"/>
+              </w:rPr>
+              <w:t xml:space="preserve">Año</w:t>
+            </w:r>
+          </w:p>
+        </w:tc>
+        <w:tc>
+          <w:tcPr/>
+          <w:p>
+            <w:pPr>
+              <w:pStyle w:val="Compact"/>
+              <w:jc w:val="right"/>
+            </w:pPr>
+            <w:r>
+              <w:rPr>
+                <w:lang w:val="es-ES"/>
+              </w:rPr>
+              <w:t xml:space="preserve">EUA → México (registro de EUA)</w:t>
+            </w:r>
+          </w:p>
+        </w:tc>
+        <w:tc>
+          <w:tcPr/>
+          <w:p>
+            <w:pPr>
+              <w:pStyle w:val="Compact"/>
+              <w:jc w:val="right"/>
+            </w:pPr>
+            <w:r>
+              <w:rPr>
+                <w:lang w:val="es-ES"/>
+              </w:rPr>
+              <w:t xml:space="preserve">México ← EUA (registro de México)</w:t>
+            </w:r>
+          </w:p>
+        </w:tc>
+        <w:tc>
+          <w:tcPr/>
+          <w:p>
+            <w:pPr>
+              <w:pStyle w:val="Compact"/>
+              <w:jc w:val="right"/>
+            </w:pPr>
+            <w:r>
+              <w:rPr>
+                <w:lang w:val="es-ES"/>
+              </w:rPr>
+              <w:t xml:space="preserve">Cociente</w:t>
+            </w:r>
+          </w:p>
+        </w:tc>
+        <w:tc>
+          <w:tcPr/>
+          <w:p>
+            <w:pPr>
+              <w:pStyle w:val="Compact"/>
+              <w:jc w:val="right"/>
+            </w:pPr>
+            <w:r>
+              <w:rPr>
+                <w:lang w:val="es-ES"/>
+              </w:rPr>
+              <w:t xml:space="preserve">Compras de Southern Copper a Asarco*</w:t>
+            </w:r>
+          </w:p>
+        </w:tc>
+      </w:tr>
+      <w:tr>
+        <w:tc>
+          <w:tcPr/>
+          <w:p>
+            <w:pPr>
+              <w:pStyle w:val="Compact"/>
+            </w:pPr>
+            <w:r>
+              <w:rPr>
+                <w:lang w:val="es-ES"/>
+              </w:rPr>
+              <w:t xml:space="preserve">2011</w:t>
+            </w:r>
+          </w:p>
+        </w:tc>
+        <w:tc>
+          <w:tcPr/>
+          <w:p>
+            <w:pPr>
+              <w:pStyle w:val="Compact"/>
+              <w:jc w:val="right"/>
+            </w:pPr>
+            <w:r>
+              <w:rPr>
+                <w:lang w:val="es-ES"/>
+              </w:rPr>
+              <w:t xml:space="preserve">812.4</w:t>
+            </w:r>
+          </w:p>
+        </w:tc>
+        <w:tc>
+          <w:tcPr/>
+          <w:p>
+            <w:pPr>
+              <w:pStyle w:val="Compact"/>
+              <w:jc w:val="right"/>
+            </w:pPr>
+            <w:r>
+              <w:rPr>
+                <w:lang w:val="es-ES"/>
+              </w:rPr>
+              <w:t xml:space="preserve">119.0</w:t>
+            </w:r>
+          </w:p>
+        </w:tc>
+        <w:tc>
+          <w:tcPr/>
+          <w:p>
+            <w:pPr>
+              <w:pStyle w:val="Compact"/>
+              <w:jc w:val="right"/>
+            </w:pPr>
+            <w:r>
+              <w:rPr>
+                <w:lang w:val="es-ES"/>
+              </w:rPr>
+              <w:t xml:space="preserve">0.15</w:t>
+            </w:r>
+          </w:p>
+        </w:tc>
+        <w:tc>
+          <w:tcPr/>
+          <w:p>
+            <w:pPr>
+              <w:pStyle w:val="Compact"/>
+              <w:jc w:val="right"/>
+            </w:pPr>
+            <w:r>
+              <w:rPr>
+                <w:lang w:val="es-ES"/>
+              </w:rPr>
+              <w:t xml:space="preserve">—</w:t>
+            </w:r>
+          </w:p>
+        </w:tc>
+      </w:tr>
+      <w:tr>
+        <w:tc>
+          <w:tcPr/>
+          <w:p>
+            <w:pPr>
+              <w:pStyle w:val="Compact"/>
+            </w:pPr>
+            <w:r>
+              <w:rPr>
+                <w:lang w:val="es-ES"/>
+              </w:rPr>
+              <w:t xml:space="preserve">2013</w:t>
+            </w:r>
+          </w:p>
+        </w:tc>
+        <w:tc>
+          <w:tcPr/>
+          <w:p>
+            <w:pPr>
+              <w:pStyle w:val="Compact"/>
+              <w:jc w:val="right"/>
+            </w:pPr>
+            <w:r>
+              <w:rPr>
+                <w:lang w:val="es-ES"/>
+              </w:rPr>
+              <w:t xml:space="preserve">1 547.6</w:t>
+            </w:r>
+          </w:p>
+        </w:tc>
+        <w:tc>
+          <w:tcPr/>
+          <w:p>
+            <w:pPr>
+              <w:pStyle w:val="Compact"/>
+              <w:jc w:val="right"/>
+            </w:pPr>
+            <w:r>
+              <w:rPr>
+                <w:lang w:val="es-ES"/>
+              </w:rPr>
+              <w:t xml:space="preserve">127.1</w:t>
+            </w:r>
+          </w:p>
+        </w:tc>
+        <w:tc>
+          <w:tcPr/>
+          <w:p>
+            <w:pPr>
+              <w:pStyle w:val="Compact"/>
+              <w:jc w:val="right"/>
+            </w:pPr>
+            <w:r>
+              <w:rPr>
+                <w:lang w:val="es-ES"/>
+              </w:rPr>
+              <w:t xml:space="preserve">0.08</w:t>
+            </w:r>
+          </w:p>
+        </w:tc>
+        <w:tc>
+          <w:tcPr/>
+          <w:p>
+            <w:pPr>
+              <w:pStyle w:val="Compact"/>
+              <w:jc w:val="right"/>
+            </w:pPr>
+            <w:r>
+              <w:rPr>
+                <w:lang w:val="es-ES"/>
+              </w:rPr>
+              <w:t xml:space="preserve">98.0</w:t>
+            </w:r>
+          </w:p>
+        </w:tc>
+      </w:tr>
+      <w:tr>
+        <w:tc>
+          <w:tcPr/>
+          <w:p>
+            <w:pPr>
+              <w:pStyle w:val="Compact"/>
+            </w:pPr>
+            <w:r>
+              <w:rPr>
+                <w:lang w:val="es-ES"/>
+              </w:rPr>
+              <w:t xml:space="preserve">2015</w:t>
+            </w:r>
+          </w:p>
+        </w:tc>
+        <w:tc>
+          <w:tcPr/>
+          <w:p>
+            <w:pPr>
+              <w:pStyle w:val="Compact"/>
+              <w:jc w:val="right"/>
+            </w:pPr>
+            <w:r>
+              <w:rPr>
+                <w:lang w:val="es-ES"/>
+              </w:rPr>
+              <w:t xml:space="preserve">2 502.4</w:t>
+            </w:r>
+          </w:p>
+        </w:tc>
+        <w:tc>
+          <w:tcPr/>
+          <w:p>
+            <w:pPr>
+              <w:pStyle w:val="Compact"/>
+              <w:jc w:val="right"/>
+            </w:pPr>
+            <w:r>
+              <w:rPr>
+                <w:lang w:val="es-ES"/>
+              </w:rPr>
+              <w:t xml:space="preserve">27.1</w:t>
+            </w:r>
+          </w:p>
+        </w:tc>
+        <w:tc>
+          <w:tcPr/>
+          <w:p>
+            <w:pPr>
+              <w:pStyle w:val="Compact"/>
+              <w:jc w:val="right"/>
+            </w:pPr>
+            <w:r>
+              <w:rPr>
+                <w:lang w:val="es-ES"/>
+              </w:rPr>
+              <w:t xml:space="preserve">0.01</w:t>
+            </w:r>
+          </w:p>
+        </w:tc>
+        <w:tc>
+          <w:tcPr/>
+          <w:p>
+            <w:pPr>
+              <w:pStyle w:val="Compact"/>
+              <w:jc w:val="right"/>
+            </w:pPr>
+            <w:r>
+              <w:rPr>
+                <w:lang w:val="es-ES"/>
+              </w:rPr>
+              <w:t xml:space="preserve">32.0</w:t>
+            </w:r>
+          </w:p>
+        </w:tc>
+      </w:tr>
+      <w:tr>
+        <w:tc>
+          <w:tcPr/>
+          <w:p>
+            <w:pPr>
+              <w:pStyle w:val="Compact"/>
+            </w:pPr>
+            <w:r>
+              <w:rPr>
+                <w:lang w:val="es-ES"/>
+              </w:rPr>
+              <w:t xml:space="preserve">2017</w:t>
+            </w:r>
+          </w:p>
+        </w:tc>
+        <w:tc>
+          <w:tcPr/>
+          <w:p>
+            <w:pPr>
+              <w:pStyle w:val="Compact"/>
+              <w:jc w:val="right"/>
+            </w:pPr>
+            <w:r>
+              <w:rPr>
+                <w:lang w:val="es-ES"/>
+              </w:rPr>
+              <w:t xml:space="preserve">1 054.1</w:t>
+            </w:r>
+          </w:p>
+        </w:tc>
+        <w:tc>
+          <w:tcPr/>
+          <w:p>
+            <w:pPr>
+              <w:pStyle w:val="Compact"/>
+              <w:jc w:val="right"/>
+            </w:pPr>
+            <w:r>
+              <w:rPr>
+                <w:lang w:val="es-ES"/>
+              </w:rPr>
+              <w:t xml:space="preserve">114.9</w:t>
+            </w:r>
+          </w:p>
+        </w:tc>
+        <w:tc>
+          <w:tcPr/>
+          <w:p>
+            <w:pPr>
+              <w:pStyle w:val="Compact"/>
+              <w:jc w:val="right"/>
+            </w:pPr>
+            <w:r>
+              <w:rPr>
+                <w:lang w:val="es-ES"/>
+              </w:rPr>
+              <w:t xml:space="preserve">0.11</w:t>
+            </w:r>
+          </w:p>
+        </w:tc>
+        <w:tc>
+          <w:tcPr/>
+          <w:p>
+            <w:pPr>
+              <w:pStyle w:val="Compact"/>
+              <w:jc w:val="right"/>
+            </w:pPr>
+            <w:r>
+              <w:rPr>
+                <w:lang w:val="es-ES"/>
+              </w:rPr>
+              <w:t xml:space="preserve">37.2</w:t>
+            </w:r>
+          </w:p>
+        </w:tc>
+      </w:tr>
+      <w:tr>
+        <w:tc>
+          <w:tcPr/>
+          <w:p>
+            <w:pPr>
+              <w:pStyle w:val="Compact"/>
+            </w:pPr>
+            <w:r>
+              <w:rPr>
+                <w:lang w:val="es-ES"/>
+              </w:rPr>
+              <w:t xml:space="preserve">2018</w:t>
+            </w:r>
+          </w:p>
+        </w:tc>
+        <w:tc>
+          <w:tcPr/>
+          <w:p>
+            <w:pPr>
+              <w:pStyle w:val="Compact"/>
+              <w:jc w:val="right"/>
+            </w:pPr>
+            <w:r>
+              <w:rPr>
+                <w:lang w:val="es-ES"/>
+              </w:rPr>
+              <w:t xml:space="preserve">1 022.5</w:t>
+            </w:r>
+          </w:p>
+        </w:tc>
+        <w:tc>
+          <w:tcPr/>
+          <w:p>
+            <w:pPr>
+              <w:pStyle w:val="Compact"/>
+              <w:jc w:val="right"/>
+            </w:pPr>
+            <w:r>
+              <w:rPr>
+                <w:lang w:val="es-ES"/>
+              </w:rPr>
+              <w:t xml:space="preserve">375.8</w:t>
+            </w:r>
+          </w:p>
+        </w:tc>
+        <w:tc>
+          <w:tcPr/>
+          <w:p>
+            <w:pPr>
+              <w:pStyle w:val="Compact"/>
+              <w:jc w:val="right"/>
+            </w:pPr>
+            <w:r>
+              <w:rPr>
+                <w:lang w:val="es-ES"/>
+              </w:rPr>
+              <w:t xml:space="preserve">0.37</w:t>
+            </w:r>
+          </w:p>
+        </w:tc>
+        <w:tc>
+          <w:tcPr/>
+          <w:p>
+            <w:pPr>
+              <w:pStyle w:val="Compact"/>
+              <w:jc w:val="right"/>
+            </w:pPr>
+            <w:r>
+              <w:rPr>
+                <w:lang w:val="es-ES"/>
+              </w:rPr>
+              <w:t xml:space="preserve">37.2</w:t>
+            </w:r>
+          </w:p>
+        </w:tc>
+      </w:tr>
+      <w:tr>
+        <w:tc>
+          <w:tcPr/>
+          <w:p>
+            <w:pPr>
+              <w:pStyle w:val="Compact"/>
+            </w:pPr>
+            <w:r>
+              <w:rPr>
+                <w:lang w:val="es-ES"/>
+              </w:rPr>
+              <w:t xml:space="preserve">2019</w:t>
+            </w:r>
+          </w:p>
+        </w:tc>
+        <w:tc>
+          <w:tcPr/>
+          <w:p>
+            <w:pPr>
+              <w:pStyle w:val="Compact"/>
+              <w:jc w:val="right"/>
+            </w:pPr>
+            <w:r>
+              <w:rPr>
+                <w:lang w:val="es-ES"/>
+              </w:rPr>
+              <w:t xml:space="preserve">1 607.8</w:t>
+            </w:r>
+          </w:p>
+        </w:tc>
+        <w:tc>
+          <w:tcPr/>
+          <w:p>
+            <w:pPr>
+              <w:pStyle w:val="Compact"/>
+              <w:jc w:val="right"/>
+            </w:pPr>
+            <w:r>
+              <w:rPr>
+                <w:lang w:val="es-ES"/>
+              </w:rPr>
+              <w:t xml:space="preserve">519.9</w:t>
+            </w:r>
+          </w:p>
+        </w:tc>
+        <w:tc>
+          <w:tcPr/>
+          <w:p>
+            <w:pPr>
+              <w:pStyle w:val="Compact"/>
+              <w:jc w:val="right"/>
+            </w:pPr>
+            <w:r>
+              <w:rPr>
+                <w:lang w:val="es-ES"/>
+              </w:rPr>
+              <w:t xml:space="preserve">0.32</w:t>
+            </w:r>
+          </w:p>
+        </w:tc>
+        <w:tc>
+          <w:tcPr/>
+          <w:p>
+            <w:pPr>
+              <w:pStyle w:val="Compact"/>
+              <w:jc w:val="right"/>
+            </w:pPr>
+            <w:r>
+              <w:rPr>
+                <w:lang w:val="es-ES"/>
+              </w:rPr>
+              <w:t xml:space="preserve">37.6</w:t>
+            </w:r>
+          </w:p>
+        </w:tc>
+      </w:tr>
+      <w:tr>
+        <w:tc>
+          <w:tcPr/>
+          <w:p>
+            <w:pPr>
+              <w:pStyle w:val="Compact"/>
+            </w:pPr>
+            <w:r>
+              <w:rPr>
+                <w:lang w:val="es-ES"/>
+              </w:rPr>
+              <w:t xml:space="preserve">2020</w:t>
+            </w:r>
+          </w:p>
+        </w:tc>
+        <w:tc>
+          <w:tcPr/>
+          <w:p>
+            <w:pPr>
+              <w:pStyle w:val="Compact"/>
+              <w:jc w:val="right"/>
+            </w:pPr>
+            <w:r>
+              <w:rPr>
+                <w:lang w:val="es-ES"/>
+              </w:rPr>
+              <w:t xml:space="preserve">1 316.4</w:t>
+            </w:r>
+          </w:p>
+        </w:tc>
+        <w:tc>
+          <w:tcPr/>
+          <w:p>
+            <w:pPr>
+              <w:pStyle w:val="Compact"/>
+              <w:jc w:val="right"/>
+            </w:pPr>
+            <w:r>
+              <w:rPr>
+                <w:lang w:val="es-ES"/>
+              </w:rPr>
+              <w:t xml:space="preserve">1 032.5</w:t>
+            </w:r>
+          </w:p>
+        </w:tc>
+        <w:tc>
+          <w:tcPr/>
+          <w:p>
+            <w:pPr>
+              <w:pStyle w:val="Compact"/>
+              <w:jc w:val="right"/>
+            </w:pPr>
+            <w:r>
+              <w:rPr>
+                <w:lang w:val="es-ES"/>
+              </w:rPr>
+              <w:t xml:space="preserve">0.78</w:t>
+            </w:r>
+          </w:p>
+        </w:tc>
+        <w:tc>
+          <w:tcPr/>
+          <w:p>
+            <w:pPr>
+              <w:pStyle w:val="Compact"/>
+              <w:jc w:val="right"/>
+            </w:pPr>
+            <w:r>
+              <w:rPr>
+                <w:lang w:val="es-ES"/>
+              </w:rPr>
+              <w:t xml:space="preserve">233.9</w:t>
+            </w:r>
+          </w:p>
+        </w:tc>
+      </w:tr>
+      <w:tr>
+        <w:tc>
+          <w:tcPr/>
+          <w:p>
+            <w:pPr>
+              <w:pStyle w:val="Compact"/>
+            </w:pPr>
+            <w:r>
+              <w:rPr>
+                <w:lang w:val="es-ES"/>
+              </w:rPr>
+              <w:t xml:space="preserve">2021</w:t>
+            </w:r>
+          </w:p>
+        </w:tc>
+        <w:tc>
+          <w:tcPr/>
+          <w:p>
+            <w:pPr>
+              <w:pStyle w:val="Compact"/>
+              <w:jc w:val="right"/>
+            </w:pPr>
+            <w:r>
+              <w:rPr>
+                <w:lang w:val="es-ES"/>
+              </w:rPr>
+              <w:t xml:space="preserve">1 630.2</w:t>
+            </w:r>
+          </w:p>
+        </w:tc>
+        <w:tc>
+          <w:tcPr/>
+          <w:p>
+            <w:pPr>
+              <w:pStyle w:val="Compact"/>
+              <w:jc w:val="right"/>
+            </w:pPr>
+            <w:r>
+              <w:rPr>
+                <w:lang w:val="es-ES"/>
+              </w:rPr>
+              <w:t xml:space="preserve">404.0</w:t>
+            </w:r>
+          </w:p>
+        </w:tc>
+        <w:tc>
+          <w:tcPr/>
+          <w:p>
+            <w:pPr>
+              <w:pStyle w:val="Compact"/>
+              <w:jc w:val="right"/>
+            </w:pPr>
+            <w:r>
+              <w:rPr>
+                <w:lang w:val="es-ES"/>
+              </w:rPr>
+              <w:t xml:space="preserve">0.25</w:t>
+            </w:r>
+          </w:p>
+        </w:tc>
+        <w:tc>
+          <w:tcPr/>
+          <w:p>
+            <w:pPr>
+              <w:pStyle w:val="Compact"/>
+              <w:jc w:val="right"/>
+            </w:pPr>
+            <w:r>
+              <w:rPr>
+                <w:lang w:val="es-ES"/>
+              </w:rPr>
+              <w:t xml:space="preserve">31.3</w:t>
+            </w:r>
+          </w:p>
+        </w:tc>
+      </w:tr>
+      <w:tr>
+        <w:tc>
+          <w:tcPr/>
+          <w:p>
+            <w:pPr>
+              <w:pStyle w:val="Compact"/>
+            </w:pPr>
+            <w:r>
+              <w:rPr>
+                <w:lang w:val="es-ES"/>
+              </w:rPr>
+              <w:t xml:space="preserve">2022</w:t>
+            </w:r>
+          </w:p>
+        </w:tc>
+        <w:tc>
+          <w:tcPr/>
+          <w:p>
+            <w:pPr>
+              <w:pStyle w:val="Compact"/>
+              <w:jc w:val="right"/>
+            </w:pPr>
+            <w:r>
+              <w:rPr>
+                <w:lang w:val="es-ES"/>
+              </w:rPr>
+              <w:t xml:space="preserve">1 763.2</w:t>
+            </w:r>
+          </w:p>
+        </w:tc>
+        <w:tc>
+          <w:tcPr/>
+          <w:p>
+            <w:pPr>
+              <w:pStyle w:val="Compact"/>
+              <w:jc w:val="right"/>
+            </w:pPr>
+            <w:r>
+              <w:rPr>
+                <w:lang w:val="es-ES"/>
+              </w:rPr>
+              <w:t xml:space="preserve">660.2</w:t>
+            </w:r>
+          </w:p>
+        </w:tc>
+        <w:tc>
+          <w:tcPr/>
+          <w:p>
+            <w:pPr>
+              <w:pStyle w:val="Compact"/>
+              <w:jc w:val="right"/>
+            </w:pPr>
+            <w:r>
+              <w:rPr>
+                <w:lang w:val="es-ES"/>
+              </w:rPr>
+              <w:t xml:space="preserve">0.37</w:t>
+            </w:r>
+          </w:p>
+        </w:tc>
+        <w:tc>
+          <w:tcPr/>
+          <w:p>
+            <w:pPr>
+              <w:pStyle w:val="Compact"/>
+              <w:jc w:val="right"/>
+            </w:pPr>
+            <w:r>
+              <w:rPr>
+                <w:lang w:val="es-ES"/>
+              </w:rPr>
+              <w:t xml:space="preserve">66.3</w:t>
+            </w:r>
+          </w:p>
+        </w:tc>
+      </w:tr>
+      <w:tr>
+        <w:tc>
+          <w:tcPr/>
+          <w:p>
+            <w:pPr>
+              <w:pStyle w:val="Compact"/>
+            </w:pPr>
+            <w:r>
+              <w:rPr>
+                <w:lang w:val="es-ES"/>
+              </w:rPr>
+              <w:t xml:space="preserve">2023</w:t>
+            </w:r>
+          </w:p>
+        </w:tc>
+        <w:tc>
+          <w:tcPr/>
+          <w:p>
+            <w:pPr>
+              <w:pStyle w:val="Compact"/>
+              <w:jc w:val="right"/>
+            </w:pPr>
+            <w:r>
+              <w:rPr>
+                <w:lang w:val="es-ES"/>
+              </w:rPr>
+              <w:t xml:space="preserve">1 521.1</w:t>
+            </w:r>
+          </w:p>
+        </w:tc>
+        <w:tc>
+          <w:tcPr/>
+          <w:p>
+            <w:pPr>
+              <w:pStyle w:val="Compact"/>
+              <w:jc w:val="right"/>
+            </w:pPr>
+            <w:r>
+              <w:rPr>
+                <w:lang w:val="es-ES"/>
+              </w:rPr>
+              <w:t xml:space="preserve">488.8</w:t>
+            </w:r>
+          </w:p>
+        </w:tc>
+        <w:tc>
+          <w:tcPr/>
+          <w:p>
+            <w:pPr>
+              <w:pStyle w:val="Compact"/>
+              <w:jc w:val="right"/>
+            </w:pPr>
+            <w:r>
+              <w:rPr>
+                <w:lang w:val="es-ES"/>
+              </w:rPr>
+              <w:t xml:space="preserve">0.32</w:t>
+            </w:r>
+          </w:p>
+        </w:tc>
+        <w:tc>
+          <w:tcPr/>
+          <w:p>
+            <w:pPr>
+              <w:pStyle w:val="Compact"/>
+              <w:jc w:val="right"/>
+            </w:pPr>
+            <w:r>
+              <w:rPr>
+                <w:lang w:val="es-ES"/>
+              </w:rPr>
+              <w:t xml:space="preserve">30.4</w:t>
+            </w:r>
+          </w:p>
+        </w:tc>
+      </w:tr>
+      <w:tr>
+        <w:tc>
+          <w:tcPr/>
+          <w:p>
+            <w:pPr>
+              <w:pStyle w:val="Compact"/>
+            </w:pPr>
+            <w:r>
+              <w:rPr>
+                <w:lang w:val="es-ES"/>
+              </w:rPr>
+              <w:t xml:space="preserve">2024</w:t>
+            </w:r>
+          </w:p>
+        </w:tc>
+        <w:tc>
+          <w:tcPr/>
+          <w:p>
+            <w:pPr>
+              <w:pStyle w:val="Compact"/>
+              <w:jc w:val="right"/>
+            </w:pPr>
+            <w:r>
+              <w:rPr>
+                <w:lang w:val="es-ES"/>
+              </w:rPr>
+              <w:t xml:space="preserve">1 639.5</w:t>
+            </w:r>
+          </w:p>
+        </w:tc>
+        <w:tc>
+          <w:tcPr/>
+          <w:p>
+            <w:pPr>
+              <w:pStyle w:val="Compact"/>
+              <w:jc w:val="right"/>
+            </w:pPr>
+            <w:r>
+              <w:rPr>
+                <w:lang w:val="es-ES"/>
+              </w:rPr>
+              <w:t xml:space="preserve">1 077.1</w:t>
+            </w:r>
+          </w:p>
+        </w:tc>
+        <w:tc>
+          <w:tcPr/>
+          <w:p>
+            <w:pPr>
+              <w:pStyle w:val="Compact"/>
+              <w:jc w:val="right"/>
+            </w:pPr>
+            <w:r>
+              <w:rPr>
+                <w:lang w:val="es-ES"/>
+              </w:rPr>
+              <w:t xml:space="preserve">0.66</w:t>
+            </w:r>
+          </w:p>
+        </w:tc>
+        <w:tc>
+          <w:tcPr/>
+          <w:p>
+            <w:pPr>
+              <w:pStyle w:val="Compact"/>
+              <w:jc w:val="right"/>
+            </w:pPr>
+            <w:r>
+              <w:rPr>
+                <w:lang w:val="es-ES"/>
+              </w:rPr>
+              <w:t xml:space="preserve">4.7</w:t>
+            </w:r>
+          </w:p>
+        </w:tc>
+      </w:tr>
+    </w:tbl>
+    <w:p>
+      <w:pPr>
+        <w:pStyle w:val="BodyText"/>
+      </w:pPr>
+      <w:r>
+        <w:rPr>
+          <w:i/>
+          <w:iCs/>
+          <w:lang w:val="es-ES"/>
+        </w:rPr>
+        <w:t xml:space="preserve">Nota:</w:t>
+      </w:r>
+      <w:r>
+        <w:rPr>
+          <w:lang w:val="es-ES"/>
+        </w:rPr>
+        <w:t xml:space="preserve"> </w:t>
+      </w:r>
+      <w:r>
+        <w:rPr>
+          <w:lang w:val="es-ES"/>
+        </w:rPr>
+        <w:t xml:space="preserve">* Todos los conceptos comprados a Asarco, no solo concentrado.</w:t>
+      </w:r>
+      <w:r>
+        <w:rPr>
+          <w:lang w:val="es-ES"/>
+        </w:rPr>
+        <w:t xml:space="preserve"> </w:t>
+      </w:r>
+      <w:r>
+        <w:rPr>
+          <w:i/>
+          <w:iCs/>
+          <w:lang w:val="es-ES"/>
+        </w:rPr>
+        <w:t xml:space="preserve">Fuente:</w:t>
+      </w:r>
+      <w:r>
+        <w:rPr>
+          <w:lang w:val="es-ES"/>
+        </w:rPr>
+        <w:t xml:space="preserve"> </w:t>
+      </w:r>
+      <w:r>
+        <w:rPr>
+          <w:lang w:val="es-ES"/>
+        </w:rPr>
+        <w:t xml:space="preserve">cálculo propio con datos de Naciones Unidas (2026); Southern Copper Corporation (2016-2026).</w:t>
+      </w:r>
+    </w:p>
+    <w:p>
+      <w:pPr>
+        <w:pStyle w:val="CaptionedFigure"/>
+      </w:pPr>
+      <w:r>
+        <w:drawing>
+          <wp:inline>
+            <wp:extent cx="5791200" cy="3220404"/>
+            <wp:effectExtent b="0" l="0" r="0" t="0"/>
+            <wp:docPr descr="Ilustración 3. Concentrado de cobre de Estados Unidos con destino México según cada registro, y compras de Southern Copper a Asarco, 2005-2024 (millones de dólares). Fuente: cálculo propio con datos de Naciones Unidas (2026) y Southern Copper Corporation (2016-2026)." title="" id="26" name="Picture"/>
+            <a:graphic>
+              <a:graphicData uri="http://schemas.openxmlformats.org/drawingml/2006/picture">
+                <pic:pic>
+                  <pic:nvPicPr>
+                    <pic:cNvPr descr="../../05%20Diagnostico%20Insumo-Producto/Figuras%20-%20Pregunta%20A/pa3_espejo_concentrado.png" id="27" name="Picture"/>
+                    <pic:cNvPicPr>
+                      <a:picLocks noChangeArrowheads="1" noChangeAspect="1"/>
+                    </pic:cNvPicPr>
+                  </pic:nvPicPr>
+                  <pic:blipFill>
+                    <a:blip r:embed="rId25"/>
+                    <a:stretch>
+                      <a:fillRect/>
+                    </a:stretch>
+                  </pic:blipFill>
+                  <pic:spPr bwMode="auto">
+                    <a:xfrm>
+                      <a:off x="0" y="0"/>
+                      <a:ext cx="5791200" cy="3220404"/>
+                    </a:xfrm>
+                    <a:prstGeom prst="rect">
+                      <a:avLst/>
+                    </a:prstGeom>
+                    <a:noFill/>
+                    <a:ln w="9525">
+                      <a:noFill/>
+                      <a:headEnd/>
+                      <a:tailEnd/>
+                    </a:ln>
+                  </pic:spPr>
+                </pic:pic>
+              </a:graphicData>
+            </a:graphic>
+          </wp:inline>
+        </w:drawing>
+      </w:r>
+    </w:p>
+    <w:p>
+      <w:pPr>
+        <w:pStyle w:val="ImageCaption"/>
+      </w:pPr>
+      <w:r>
+        <w:rPr>
+          <w:b/>
+          <w:bCs/>
+          <w:lang w:val="es-ES"/>
+        </w:rPr>
+        <w:t xml:space="preserve">Ilustración 3.</w:t>
+      </w:r>
+      <w:r>
+        <w:rPr>
+          <w:lang w:val="es-ES"/>
+        </w:rPr>
+        <w:t xml:space="preserve"> </w:t>
+      </w:r>
+      <w:r>
+        <w:rPr>
+          <w:lang w:val="es-ES"/>
+        </w:rPr>
+        <w:t xml:space="preserve">Concentrado de cobre de Estados Unidos con destino México según cada registro, y compras de Southern Copper a Asarco, 2005-2024 (millones de dólares).</w:t>
+      </w:r>
+      <w:r>
+        <w:rPr>
+          <w:lang w:val="es-ES"/>
+        </w:rPr>
+        <w:t xml:space="preserve"> </w:t>
+      </w:r>
+      <w:r>
+        <w:rPr>
+          <w:i/>
+          <w:iCs/>
+          <w:lang w:val="es-ES"/>
+        </w:rPr>
+        <w:t xml:space="preserve">Fuente:</w:t>
+      </w:r>
+      <w:r>
+        <w:rPr>
+          <w:lang w:val="es-ES"/>
+        </w:rPr>
+        <w:t xml:space="preserve"> </w:t>
+      </w:r>
+      <w:r>
+        <w:rPr>
+          <w:lang w:val="es-ES"/>
+        </w:rPr>
+        <w:t xml:space="preserve">cálculo propio con datos de Naciones Unidas (2026) y Southern Copper Corporation (2016-2026).</w:t>
+      </w:r>
+    </w:p>
+    <w:p>
+      <w:pPr>
+        <w:pStyle w:val="BodyText"/>
+      </w:pPr>
+      <w:r>
+        <w:rPr>
+          <w:lang w:val="es-ES"/>
+        </w:rPr>
+        <w:t xml:space="preserve">Tres hechos describen la composición de ese flujo.</w:t>
+      </w:r>
+    </w:p>
+    <w:p>
+      <w:pPr>
+        <w:pStyle w:val="BodyText"/>
+      </w:pPr>
+      <w:r>
+        <w:rPr>
+          <w:lang w:val="es-ES"/>
+        </w:rPr>
+        <w:t xml:space="preserve">Primero, entre 2011 y 2017 Estados Unidos registra exportaciones de concentrado a México por 10 742 millones de dólares acumulados, y México registra importaciones de concentrado desde Estados Unidos por 543 millones, 5 % de esa cifra. Entre 2018 y 2024 las cifras son 10 501 y 4 558 millones (43 %). En 2020-2024, Estados Unidos es el origen de entre 91 % y 100 % del concentrado que importa México.</w:t>
+      </w:r>
+    </w:p>
+    <w:p>
+      <w:pPr>
+        <w:pStyle w:val="BodyText"/>
+      </w:pPr>
+      <w:r>
+        <w:rPr>
+          <w:lang w:val="es-ES"/>
+        </w:rPr>
+        <w:t xml:space="preserve">Segundo, los informes anuales de Southern Copper describen un cambio en sus transacciones con Asarco. En los informes de 2015 y 2019, sus operaciones mexicanas compraban a Asarco chatarra y otro mineral residual de cobre, y le vendían cátodos, alambrón y ánodos. Desde el informe de 2020, posterior al cierre de Hayden en octubre de 2019, le compran concentrado de cobre y pagan servicios de maquila. El total de las compras a Asarco fue de 233.9 millones de dólares en 2020 y de entre 4.7 y 71.5 millones en 2021-2025; en 2020-2024 equivale como máximo a 23 % de las importaciones mexicanas de concentrado desde Estados Unidos del mismo año.</w:t>
+      </w:r>
+    </w:p>
+    <w:p>
+      <w:pPr>
+        <w:pStyle w:val="BodyText"/>
+      </w:pPr>
+      <w:r>
+        <w:rPr>
+          <w:lang w:val="es-ES"/>
+        </w:rPr>
+        <w:t xml:space="preserve">Tercero, documentos de empresas mineras de Arizona describen el envío de su concentrado al puerto de Guaymas, Sonora, para embarcarlo hacia Asia. Mercator Minerals (2012) nombra entre los destinos del concentrado de su mina en Arizona a China «through the port of Guaymas, Mexico». Información de prensa especializada, cuyo texto completo no se pudo consultar, describe la misma ruta para el concentrado de Pinto Valley (Capstone) y, desde el cierre de Hayden, para el de las minas Mission y Ray de Asarco.</w:t>
+      </w:r>
+    </w:p>
+    <w:p>
+      <w:pPr>
+        <w:pStyle w:val="BodyText"/>
+      </w:pPr>
+      <w:r>
+        <w:rPr>
+          <w:lang w:val="es-ES"/>
+        </w:rPr>
+        <w:t xml:space="preserve">Los tres hechos describen que una parte del concentrado que Estados Unidos registra como exportación a México no aparece como importación en el registro mexicano, y que la ruta por Guaymas hacia Asia está documentada para varias minas de Arizona. Con los datos disponibles no se puede separar qué parte del flujo es tránsito hacia terceros países y qué parte se funde en México.</w:t>
+      </w:r>
+    </w:p>
+    <w:bookmarkEnd w:id="28"/>
+    <w:bookmarkEnd w:id="29"/>
+    <w:bookmarkStart w:id="30" w:name="límites-de-los-datos"/>
     <w:p>
       <w:pPr>
         <w:pStyle w:val="Heading2"/>
@@ -5473,7 +6714,7 @@
         <w:rPr>
           <w:lang w:val="es-ES"/>
         </w:rPr>
-        <w:t xml:space="preserve">Los registros de México y de Estados Unidos coinciden o difieren en menos de 25 % en la mayoría de los años con flujo (1995, 2001, 2003-2005, 2011-2013, 2017-2018), pero no en 2000 (59.9 frente a 0 millones de dólares), 2015 (11.6 frente a 0) y 2019 (276.5 frente a 148.4). La diferencia de 2000 equivale a la mitad de las exportaciones mexicanas de concentrado de ese año. Las explicaciones posibles —destino declarado distinto del destino final, mercancía en tránsito o bajo régimen aduanero que no se registra como importación definitiva— no se han verificado. La verificación requiere las estadísticas de la Oficina del Censo de Estados Unidos que distinguen importaciones generales de importaciones para consumo.</w:t>
+        <w:t xml:space="preserve">Los registros de México y de Estados Unidos coinciden o difieren en menos de 25 % en la mayoría de los años con flujo (1995, 2001, 2003-2005, 2011-2013, 2017-2018), pero no en 2000 (59.9 frente a 0 millones de dólares), 2015 (11.6 frente a 0) y 2019 (276.5 frente a 148.4). La diferencia de 2000 equivale a la mitad de las exportaciones mexicanas de concentrado de ese año. Las explicaciones posibles —destino declarado distinto del destino final, mercancía en tránsito o bajo régimen aduanero que no se registra como importación definitiva— no se han verificado para ese año. Para el flujo inverso (concentrado de Estados Unidos con destino México), el tránsito por el puerto de Guaymas está documentado para varias minas de Arizona (sección 3.7). La verificación requiere las estadísticas de la Oficina del Censo de Estados Unidos que distinguen importaciones generales de importaciones para consumo.</w:t>
       </w:r>
     </w:p>
     <w:p>
@@ -5754,37 +6995,40 @@
         <w:rPr>
           <w:lang w:val="es-ES"/>
         </w:rPr>
-        <w:t xml:space="preserve">El</w:t>
-      </w:r>
-      <w:r>
-        <w:rPr>
-          <w:lang w:val="es-ES"/>
-        </w:rPr>
-        <w:t xml:space="preserve"> </w:t>
-      </w:r>
-      <w:r>
-        <w:rPr>
-          <w:i/>
-          <w:iCs/>
-          <w:lang w:val="es-ES"/>
-        </w:rPr>
-        <w:t xml:space="preserve">Minerals Yearbook</w:t>
-      </w:r>
-      <w:r>
-        <w:rPr>
-          <w:lang w:val="es-ES"/>
-        </w:rPr>
-        <w:t xml:space="preserve"> </w:t>
-      </w:r>
-      <w:r>
-        <w:rPr>
-          <w:lang w:val="es-ES"/>
-        </w:rPr>
-        <w:t xml:space="preserve">documenta el flujo de concentrado de Estados Unidos hacia México, pero no su composición por empresa ni su relación con las operaciones de Grupo México a ambos lados de la frontera (ASARCO en Arizona; la fundición de La Caridad en Sonora). Esa composición requiere los informes de las empresas.</w:t>
-      </w:r>
-    </w:p>
-    <w:bookmarkEnd w:id="26"/>
-    <w:bookmarkStart w:id="27" w:name="síntesis-descriptiva"/>
+        <w:t xml:space="preserve">Las transacciones con Asarco proceden de la nota de partes relacionadas de los 10-K de Southern Copper, que agrupa todos los conceptos sin separar el concentrado. La ruta por Guaymas se documenta con un informe de 2011 (Mercator Minerals) y con información de prensa especializada de fecha incierta cuyo texto completo no se consultó. Faltan los informes de Freeport-McMoRan, Capstone Copper y Grupo México, y las estadísticas de carga del puerto de Guaymas, para separar el tránsito de lo que se funde en México.</w:t>
+      </w:r>
+    </w:p>
+    <w:p>
+      <w:pPr>
+        <w:pStyle w:val="Compact"/>
+        <w:numPr>
+          <w:ilvl w:val="0"/>
+          <w:numId w:val="1002"/>
+        </w:numPr>
+      </w:pPr>
+      <w:r>
+        <w:rPr>
+          <w:b/>
+          <w:bCs/>
+          <w:lang w:val="es-ES"/>
+        </w:rPr>
+        <w:t xml:space="preserve">Unidades de los registros bilaterales.</w:t>
+      </w:r>
+      <w:r>
+        <w:rPr>
+          <w:lang w:val="es-ES"/>
+        </w:rPr>
+        <w:t xml:space="preserve"> </w:t>
+      </w:r>
+      <w:r>
+        <w:rPr>
+          <w:lang w:val="es-ES"/>
+        </w:rPr>
+        <w:t xml:space="preserve">El concentrado se registra en cobre contenido del lado estadounidense y en peso de producto del lado mexicano; por eso la comparación entre registros se hace en valor.</w:t>
+      </w:r>
+    </w:p>
+    <w:bookmarkEnd w:id="30"/>
+    <w:bookmarkStart w:id="31" w:name="síntesis-descriptiva"/>
     <w:p>
       <w:pPr>
         <w:pStyle w:val="Heading2"/>
@@ -5853,11 +7097,11 @@
         <w:rPr>
           <w:lang w:val="es-ES"/>
         </w:rPr>
-        <w:t xml:space="preserve">Entre ambos países el flujo de concentrado se invirtió: desde 2013 México recibe más de la mitad del concentrado que exporta Estados Unidos.</w:t>
-      </w:r>
-    </w:p>
-    <w:bookmarkEnd w:id="27"/>
-    <w:bookmarkStart w:id="28" w:name="referencias"/>
+        <w:t xml:space="preserve">Según el registro estadounidense, desde 2013 México es el destino de más de la mitad del concentrado que exporta Estados Unidos. México registra como importación 5 % de ese flujo en 2011-2017 y 43 % en 2018-2024; las compras de Southern Copper a Asarco, que desde 2020 incluyen concentrado, equivalen como máximo a 23 % de esas importaciones en 2020-2024, y la ruta del concentrado de Arizona por Guaymas hacia Asia está documentada para varias minas.</w:t>
+      </w:r>
+    </w:p>
+    <w:bookmarkEnd w:id="31"/>
+    <w:bookmarkStart w:id="32" w:name="referencias"/>
     <w:p>
       <w:pPr>
         <w:pStyle w:val="Heading2"/>
@@ -5908,7 +7152,7 @@
         <w:rPr>
           <w:lang w:val="es-ES"/>
         </w:rPr>
-        <w:t xml:space="preserve">Naciones Unidas. (2026).</w:t>
+        <w:t xml:space="preserve">Mercator Minerals Ltd. (2012).</w:t>
       </w:r>
       <w:r>
         <w:rPr>
@@ -5922,19 +7166,19 @@
           <w:iCs/>
           <w:lang w:val="es-ES"/>
         </w:rPr>
-        <w:t xml:space="preserve">UN Comtrade Database</w:t>
-      </w:r>
-      <w:r>
-        <w:rPr>
-          <w:lang w:val="es-ES"/>
-        </w:rPr>
-        <w:t xml:space="preserve"> </w:t>
-      </w:r>
-      <w:r>
-        <w:rPr>
-          <w:lang w:val="es-ES"/>
-        </w:rPr>
-        <w:t xml:space="preserve">[Base de datos]. Departamento de Asuntos Económicos y Sociales, División de Estadística. Consultado el 8 de octubre de 2026. https://comtradeplus.un.org/</w:t>
+        <w:t xml:space="preserve">Management’s discussion and analysis for the year ended December 31, 2011</w:t>
+      </w:r>
+      <w:r>
+        <w:rPr>
+          <w:lang w:val="es-ES"/>
+        </w:rPr>
+        <w:t xml:space="preserve"> </w:t>
+      </w:r>
+      <w:r>
+        <w:rPr>
+          <w:lang w:val="es-ES"/>
+        </w:rPr>
+        <w:t xml:space="preserve">(Form 40-F, Exhibit 99.3). U.S. Securities and Exchange Commission. https://www.sec.gov/Archives/edgar/data/1286798/000091228212000292/ex99_3.htm</w:t>
       </w:r>
     </w:p>
     <w:p>
@@ -5945,7 +7189,7 @@
         <w:rPr>
           <w:lang w:val="es-ES"/>
         </w:rPr>
-        <w:t xml:space="preserve">Porter, K. E., Edelstein, D. L., Brininstool, M., y Flanagan, D. M. (2023). Copper statistics. En T. D. Kelly y G. R. Matos (Comps.),</w:t>
+        <w:t xml:space="preserve">Naciones Unidas. (2026).</w:t>
       </w:r>
       <w:r>
         <w:rPr>
@@ -5959,19 +7203,19 @@
           <w:iCs/>
           <w:lang w:val="es-ES"/>
         </w:rPr>
-        <w:t xml:space="preserve">Historical statistics for mineral and material commodities in the United States</w:t>
-      </w:r>
-      <w:r>
-        <w:rPr>
-          <w:lang w:val="es-ES"/>
-        </w:rPr>
-        <w:t xml:space="preserve"> </w:t>
-      </w:r>
-      <w:r>
-        <w:rPr>
-          <w:lang w:val="es-ES"/>
-        </w:rPr>
-        <w:t xml:space="preserve">(Data Series 140). U.S. Geological Survey.</w:t>
+        <w:t xml:space="preserve">UN Comtrade Database</w:t>
+      </w:r>
+      <w:r>
+        <w:rPr>
+          <w:lang w:val="es-ES"/>
+        </w:rPr>
+        <w:t xml:space="preserve"> </w:t>
+      </w:r>
+      <w:r>
+        <w:rPr>
+          <w:lang w:val="es-ES"/>
+        </w:rPr>
+        <w:t xml:space="preserve">[Base de datos]. Departamento de Asuntos Económicos y Sociales, División de Estadística. Consultado el 8 de octubre de 2026. https://comtradeplus.un.org/</w:t>
       </w:r>
     </w:p>
     <w:p>
@@ -5982,7 +7226,7 @@
         <w:rPr>
           <w:lang w:val="es-ES"/>
         </w:rPr>
-        <w:t xml:space="preserve">U.S. Geological Survey. (1996-2025).</w:t>
+        <w:t xml:space="preserve">Porter, K. E., Edelstein, D. L., Brininstool, M., y Flanagan, D. M. (2023). Copper statistics. En T. D. Kelly y G. R. Matos (Comps.),</w:t>
       </w:r>
       <w:r>
         <w:rPr>
@@ -5996,19 +7240,19 @@
           <w:iCs/>
           <w:lang w:val="es-ES"/>
         </w:rPr>
-        <w:t xml:space="preserve">Minerals yearbook, volume I: Metals and minerals. Copper</w:t>
-      </w:r>
-      <w:r>
-        <w:rPr>
-          <w:lang w:val="es-ES"/>
-        </w:rPr>
-        <w:t xml:space="preserve"> </w:t>
-      </w:r>
-      <w:r>
-        <w:rPr>
-          <w:lang w:val="es-ES"/>
-        </w:rPr>
-        <w:t xml:space="preserve">(ediciones 1994 a 2022). U.S. Geological Survey.</w:t>
+        <w:t xml:space="preserve">Historical statistics for mineral and material commodities in the United States</w:t>
+      </w:r>
+      <w:r>
+        <w:rPr>
+          <w:lang w:val="es-ES"/>
+        </w:rPr>
+        <w:t xml:space="preserve"> </w:t>
+      </w:r>
+      <w:r>
+        <w:rPr>
+          <w:lang w:val="es-ES"/>
+        </w:rPr>
+        <w:t xml:space="preserve">(Data Series 140). U.S. Geological Survey.</w:t>
       </w:r>
     </w:p>
     <w:p>
@@ -6019,7 +7263,7 @@
         <w:rPr>
           <w:lang w:val="es-ES"/>
         </w:rPr>
-        <w:t xml:space="preserve">U.S. Geological Survey. (2000-2026).</w:t>
+        <w:t xml:space="preserve">Southern Copper Corporation. (2016-2026).</w:t>
       </w:r>
       <w:r>
         <w:rPr>
@@ -6033,6 +7277,80 @@
           <w:iCs/>
           <w:lang w:val="es-ES"/>
         </w:rPr>
+        <w:t xml:space="preserve">Annual report on Form 10-K</w:t>
+      </w:r>
+      <w:r>
+        <w:rPr>
+          <w:lang w:val="es-ES"/>
+        </w:rPr>
+        <w:t xml:space="preserve"> </w:t>
+      </w:r>
+      <w:r>
+        <w:rPr>
+          <w:lang w:val="es-ES"/>
+        </w:rPr>
+        <w:t xml:space="preserve">(ejercicios 2015 a 2025). U.S. Securities and Exchange Commission. https://www.sec.gov/cgi-bin/browse-edgar?action=getcompany&amp;CIK=0001001838&amp;type=10-K</w:t>
+      </w:r>
+    </w:p>
+    <w:p>
+      <w:pPr>
+        <w:pStyle w:val="BodyText"/>
+      </w:pPr>
+      <w:r>
+        <w:rPr>
+          <w:lang w:val="es-ES"/>
+        </w:rPr>
+        <w:t xml:space="preserve">U.S. Geological Survey. (1996-2025).</w:t>
+      </w:r>
+      <w:r>
+        <w:rPr>
+          <w:lang w:val="es-ES"/>
+        </w:rPr>
+        <w:t xml:space="preserve"> </w:t>
+      </w:r>
+      <w:r>
+        <w:rPr>
+          <w:i/>
+          <w:iCs/>
+          <w:lang w:val="es-ES"/>
+        </w:rPr>
+        <w:t xml:space="preserve">Minerals yearbook, volume I: Metals and minerals. Copper</w:t>
+      </w:r>
+      <w:r>
+        <w:rPr>
+          <w:lang w:val="es-ES"/>
+        </w:rPr>
+        <w:t xml:space="preserve"> </w:t>
+      </w:r>
+      <w:r>
+        <w:rPr>
+          <w:lang w:val="es-ES"/>
+        </w:rPr>
+        <w:t xml:space="preserve">(ediciones 1994 a 2022). U.S. Geological Survey.</w:t>
+      </w:r>
+    </w:p>
+    <w:p>
+      <w:pPr>
+        <w:pStyle w:val="BodyText"/>
+      </w:pPr>
+      <w:r>
+        <w:rPr>
+          <w:lang w:val="es-ES"/>
+        </w:rPr>
+        <w:t xml:space="preserve">U.S. Geological Survey. (2000-2026).</w:t>
+      </w:r>
+      <w:r>
+        <w:rPr>
+          <w:lang w:val="es-ES"/>
+        </w:rPr>
+        <w:t xml:space="preserve"> </w:t>
+      </w:r>
+      <w:r>
+        <w:rPr>
+          <w:i/>
+          <w:iCs/>
+          <w:lang w:val="es-ES"/>
+        </w:rPr>
         <w:t xml:space="preserve">Mineral commodity summaries. Copper</w:t>
       </w:r>
       <w:r>
@@ -6048,7 +7366,7 @@
         <w:t xml:space="preserve">(ediciones 2000, 2005, 2010, 2015, 2020, 2025 y 2026). U.S. Geological Survey.</w:t>
       </w:r>
     </w:p>
-    <w:bookmarkEnd w:id="28"/>
+    <w:bookmarkEnd w:id="32"/>
     <w:sectPr>
       <w:footnotePr>
         <w:numRestart w:val="eachSect"/>

</xml_diff>

<commit_message>
Pregunta A: informes de Grupo México, Capstone y Freeport sobre el destino del concentrado
Fuentes primarias: Informe Anual BMV de Grupo México 2016-2025 (Mission y Ray
pasan de la fundición de Hayden al puerto de Guaymas desde 2022), reporte
técnico de Pinto Valley 2021 (Guaymas hacia Asia) y 10-K de Freeport (sin
mención a México). Cuadro 7 en el escrito independiente.

Co-Authored-By: Claude Opus 5.5 <noreply@anthropic.com>
</commit_message>
<xml_diff>
--- a/ICR/11 Redaccion/Escritos independientes/Mexico y el abasto de cobre de Estados Unidos, 1992-2024.docx
+++ b/ICR/11 Redaccion/Escritos independientes/Mexico y el abasto de cobre de Estados Unidos, 1992-2024.docx
@@ -357,7 +357,7 @@
         <w:rPr>
           <w:lang w:val="es-ES"/>
         </w:rPr>
-        <w:t xml:space="preserve">La nota de operaciones con partes relacionadas de los informes anuales 10-K de Southern Copper Corporation, 2015-2025 (Southern Copper Corporation, 2016-2026), y el análisis de la administración de Mercator Minerals para 2011 (Mercator Minerals, 2012).</w:t>
+        <w:t xml:space="preserve">La nota de operaciones con partes relacionadas de los informes anuales 10-K de Southern Copper Corporation, 2015-2025 (Southern Copper Corporation, 2016-2026); la descripción de las operaciones de Asarco en los informes anuales de Grupo México a la Bolsa Mexicana de Valores, 2016-2025 (Grupo México, 2017-2026); el reporte técnico de la mina Pinto Valley (Capstone Copper, 2021); los informes 10-K de Freeport-McMoRan de 2015 y 2024 (Freeport-McMoRan, 2016, 2025); y el análisis de la administración de Mercator Minerals para 2011 (Mercator Minerals, 2012).</w:t>
       </w:r>
     </w:p>
     <w:bookmarkEnd w:id="10"/>
@@ -6660,7 +6660,7 @@
         <w:rPr>
           <w:lang w:val="es-ES"/>
         </w:rPr>
-        <w:t xml:space="preserve">Tercero, documentos de empresas mineras de Arizona describen el envío de su concentrado al puerto de Guaymas, Sonora, para embarcarlo hacia Asia. Mercator Minerals (2012) nombra entre los destinos del concentrado de su mina en Arizona a China «through the port of Guaymas, Mexico». Información de prensa especializada, cuyo texto completo no se pudo consultar, describe la misma ruta para el concentrado de Pinto Valley (Capstone) y, desde el cierre de Hayden, para el de las minas Mission y Ray de Asarco.</w:t>
+        <w:t xml:space="preserve">Tercero, los informes de las empresas mineras de Arizona describen el destino de su concentrado (Cuadro 7).</w:t>
       </w:r>
     </w:p>
     <w:p>
@@ -6669,9 +6669,438 @@
       </w:pPr>
       <w:r>
         <w:rPr>
-          <w:lang w:val="es-ES"/>
-        </w:rPr>
-        <w:t xml:space="preserve">Los tres hechos describen que una parte del concentrado que Estados Unidos registra como exportación a México no aparece como importación en el registro mexicano, y que la ruta por Guaymas hacia Asia está documentada para varias minas de Arizona. Con los datos disponibles no se puede separar qué parte del flujo es tránsito hacia terceros países y qué parte se funde en México.</w:t>
+          <w:b/>
+          <w:bCs/>
+          <w:lang w:val="es-ES"/>
+        </w:rPr>
+        <w:t xml:space="preserve">Cuadro 7.</w:t>
+      </w:r>
+      <w:r>
+        <w:rPr>
+          <w:lang w:val="es-ES"/>
+        </w:rPr>
+        <w:t xml:space="preserve"> </w:t>
+      </w:r>
+      <w:r>
+        <w:rPr>
+          <w:lang w:val="es-ES"/>
+        </w:rPr>
+        <w:t xml:space="preserve">Destino del concentrado de cobre de minas de Arizona según los informes de las empresas</w:t>
+      </w:r>
+    </w:p>
+    <w:tbl>
+      <w:tblPr>
+        <w:tblStyle w:val="Table"/>
+        <w:tblW w:type="pct" w:w="5000"/>
+        <w:tblLayout w:type="fixed"/>
+        <w:tblLook w:firstRow="1" w:lastRow="0" w:firstColumn="0" w:lastColumn="0" w:noHBand="0" w:noVBand="0" w:val="0020"/>
+      </w:tblPr>
+      <w:tblGrid>
+        <w:gridCol w:w="2640"/>
+        <w:gridCol w:w="2640"/>
+        <w:gridCol w:w="2640"/>
+      </w:tblGrid>
+      <w:tr>
+        <w:trPr>
+          <w:tblHeader w:val="on"/>
+        </w:trPr>
+        <w:tc>
+          <w:tcPr/>
+          <w:p>
+            <w:pPr>
+              <w:pStyle w:val="Compact"/>
+            </w:pPr>
+            <w:r>
+              <w:rPr>
+                <w:lang w:val="es-ES"/>
+              </w:rPr>
+              <w:t xml:space="preserve">Empresa y mina</w:t>
+            </w:r>
+          </w:p>
+        </w:tc>
+        <w:tc>
+          <w:tcPr/>
+          <w:p>
+            <w:pPr>
+              <w:pStyle w:val="Compact"/>
+            </w:pPr>
+            <w:r>
+              <w:rPr>
+                <w:lang w:val="es-ES"/>
+              </w:rPr>
+              <w:t xml:space="preserve">Periodo del documento</w:t>
+            </w:r>
+          </w:p>
+        </w:tc>
+        <w:tc>
+          <w:tcPr/>
+          <w:p>
+            <w:pPr>
+              <w:pStyle w:val="Compact"/>
+            </w:pPr>
+            <w:r>
+              <w:rPr>
+                <w:lang w:val="es-ES"/>
+              </w:rPr>
+              <w:t xml:space="preserve">Destino descrito</w:t>
+            </w:r>
+          </w:p>
+        </w:tc>
+      </w:tr>
+      <w:tr>
+        <w:tc>
+          <w:tcPr/>
+          <w:p>
+            <w:pPr>
+              <w:pStyle w:val="Compact"/>
+            </w:pPr>
+            <w:r>
+              <w:rPr>
+                <w:lang w:val="es-ES"/>
+              </w:rPr>
+              <w:t xml:space="preserve">Asarco (Grupo México): Mission</w:t>
+            </w:r>
+          </w:p>
+        </w:tc>
+        <w:tc>
+          <w:tcPr/>
+          <w:p>
+            <w:pPr>
+              <w:pStyle w:val="Compact"/>
+            </w:pPr>
+            <w:r>
+              <w:rPr>
+                <w:lang w:val="es-ES"/>
+              </w:rPr>
+              <w:t xml:space="preserve">Informes 2016-2021</w:t>
+            </w:r>
+          </w:p>
+        </w:tc>
+        <w:tc>
+          <w:tcPr/>
+          <w:p>
+            <w:pPr>
+              <w:pStyle w:val="Compact"/>
+            </w:pPr>
+            <w:r>
+              <w:rPr>
+                <w:lang w:val="es-ES"/>
+              </w:rPr>
+              <w:t xml:space="preserve">Fundición de Hayden, Arizona, en camión</w:t>
+            </w:r>
+          </w:p>
+        </w:tc>
+      </w:tr>
+      <w:tr>
+        <w:tc>
+          <w:tcPr/>
+          <w:p>
+            <w:pPr>
+              <w:pStyle w:val="Compact"/>
+            </w:pPr>
+            <w:r>
+              <w:rPr>
+                <w:lang w:val="es-ES"/>
+              </w:rPr>
+              <w:t xml:space="preserve">Asarco (Grupo México): Ray</w:t>
+            </w:r>
+          </w:p>
+        </w:tc>
+        <w:tc>
+          <w:tcPr/>
+          <w:p>
+            <w:pPr>
+              <w:pStyle w:val="Compact"/>
+            </w:pPr>
+            <w:r>
+              <w:rPr>
+                <w:lang w:val="es-ES"/>
+              </w:rPr>
+              <w:t xml:space="preserve">Informes 2016-2021</w:t>
+            </w:r>
+          </w:p>
+        </w:tc>
+        <w:tc>
+          <w:tcPr/>
+          <w:p>
+            <w:pPr>
+              <w:pStyle w:val="Compact"/>
+            </w:pPr>
+            <w:r>
+              <w:rPr>
+                <w:lang w:val="es-ES"/>
+              </w:rPr>
+              <w:t xml:space="preserve">Fundición de Hayden, Arizona, en ferrocarril</w:t>
+            </w:r>
+          </w:p>
+        </w:tc>
+      </w:tr>
+      <w:tr>
+        <w:tc>
+          <w:tcPr/>
+          <w:p>
+            <w:pPr>
+              <w:pStyle w:val="Compact"/>
+            </w:pPr>
+            <w:r>
+              <w:rPr>
+                <w:lang w:val="es-ES"/>
+              </w:rPr>
+              <w:t xml:space="preserve">Asarco (Grupo México): Mission</w:t>
+            </w:r>
+          </w:p>
+        </w:tc>
+        <w:tc>
+          <w:tcPr/>
+          <w:p>
+            <w:pPr>
+              <w:pStyle w:val="Compact"/>
+            </w:pPr>
+            <w:r>
+              <w:rPr>
+                <w:lang w:val="es-ES"/>
+              </w:rPr>
+              <w:t xml:space="preserve">Informes 2022-2025</w:t>
+            </w:r>
+          </w:p>
+        </w:tc>
+        <w:tc>
+          <w:tcPr/>
+          <w:p>
+            <w:pPr>
+              <w:pStyle w:val="Compact"/>
+            </w:pPr>
+            <w:r>
+              <w:rPr>
+                <w:lang w:val="es-ES"/>
+              </w:rPr>
+              <w:t xml:space="preserve">Puerto de Guaymas, Sonora, en camión, «para su venta»</w:t>
+            </w:r>
+          </w:p>
+        </w:tc>
+      </w:tr>
+      <w:tr>
+        <w:tc>
+          <w:tcPr/>
+          <w:p>
+            <w:pPr>
+              <w:pStyle w:val="Compact"/>
+            </w:pPr>
+            <w:r>
+              <w:rPr>
+                <w:lang w:val="es-ES"/>
+              </w:rPr>
+              <w:t xml:space="preserve">Asarco (Grupo México): Ray</w:t>
+            </w:r>
+          </w:p>
+        </w:tc>
+        <w:tc>
+          <w:tcPr/>
+          <w:p>
+            <w:pPr>
+              <w:pStyle w:val="Compact"/>
+            </w:pPr>
+            <w:r>
+              <w:rPr>
+                <w:lang w:val="es-ES"/>
+              </w:rPr>
+              <w:t xml:space="preserve">Informes 2022-2025</w:t>
+            </w:r>
+          </w:p>
+        </w:tc>
+        <w:tc>
+          <w:tcPr/>
+          <w:p>
+            <w:pPr>
+              <w:pStyle w:val="Compact"/>
+            </w:pPr>
+            <w:r>
+              <w:rPr>
+                <w:lang w:val="es-ES"/>
+              </w:rPr>
+              <w:t xml:space="preserve">Puerto de Guaymas, Sonora, en ferrocarril, «para su venta»</w:t>
+            </w:r>
+          </w:p>
+        </w:tc>
+      </w:tr>
+      <w:tr>
+        <w:tc>
+          <w:tcPr/>
+          <w:p>
+            <w:pPr>
+              <w:pStyle w:val="Compact"/>
+            </w:pPr>
+            <w:r>
+              <w:rPr>
+                <w:lang w:val="es-ES"/>
+              </w:rPr>
+              <w:t xml:space="preserve">Capstone Copper: Pinto Valley</w:t>
+            </w:r>
+          </w:p>
+        </w:tc>
+        <w:tc>
+          <w:tcPr/>
+          <w:p>
+            <w:pPr>
+              <w:pStyle w:val="Compact"/>
+            </w:pPr>
+            <w:r>
+              <w:rPr>
+                <w:lang w:val="es-ES"/>
+              </w:rPr>
+              <w:t xml:space="preserve">Reporte técnico 2021</w:t>
+            </w:r>
+          </w:p>
+        </w:tc>
+        <w:tc>
+          <w:tcPr/>
+          <w:p>
+            <w:pPr>
+              <w:pStyle w:val="Compact"/>
+            </w:pPr>
+            <w:r>
+              <w:rPr>
+                <w:lang w:val="es-ES"/>
+              </w:rPr>
+              <w:t xml:space="preserve">Fundiciones de Arizona (doméstico); el concentrado con destino internacional va en camión al puerto de Guaymas y de ahí en barco a la fundición compradora, sobre todo en Asia</w:t>
+            </w:r>
+          </w:p>
+        </w:tc>
+      </w:tr>
+      <w:tr>
+        <w:tc>
+          <w:tcPr/>
+          <w:p>
+            <w:pPr>
+              <w:pStyle w:val="Compact"/>
+            </w:pPr>
+            <w:r>
+              <w:rPr>
+                <w:lang w:val="es-ES"/>
+              </w:rPr>
+              <w:t xml:space="preserve">Mercator Minerals: Mineral Park</w:t>
+            </w:r>
+          </w:p>
+        </w:tc>
+        <w:tc>
+          <w:tcPr/>
+          <w:p>
+            <w:pPr>
+              <w:pStyle w:val="Compact"/>
+            </w:pPr>
+            <w:r>
+              <w:rPr>
+                <w:lang w:val="es-ES"/>
+              </w:rPr>
+              <w:t xml:space="preserve">2011</w:t>
+            </w:r>
+          </w:p>
+        </w:tc>
+        <w:tc>
+          <w:tcPr/>
+          <w:p>
+            <w:pPr>
+              <w:pStyle w:val="Compact"/>
+            </w:pPr>
+            <w:r>
+              <w:rPr>
+                <w:lang w:val="es-ES"/>
+              </w:rPr>
+              <w:t xml:space="preserve">China por el puerto de Guaymas; fundiciones de Hayden y Miami, Arizona</w:t>
+            </w:r>
+          </w:p>
+        </w:tc>
+      </w:tr>
+      <w:tr>
+        <w:tc>
+          <w:tcPr/>
+          <w:p>
+            <w:pPr>
+              <w:pStyle w:val="Compact"/>
+            </w:pPr>
+            <w:r>
+              <w:rPr>
+                <w:lang w:val="es-ES"/>
+              </w:rPr>
+              <w:t xml:space="preserve">Freeport-McMoRan: Morenci, Bagdad, Sierrita, Chino</w:t>
+            </w:r>
+          </w:p>
+        </w:tc>
+        <w:tc>
+          <w:tcPr/>
+          <w:p>
+            <w:pPr>
+              <w:pStyle w:val="Compact"/>
+            </w:pPr>
+            <w:r>
+              <w:rPr>
+                <w:lang w:val="es-ES"/>
+              </w:rPr>
+              <w:t xml:space="preserve">10-K 2015 y 2024</w:t>
+            </w:r>
+          </w:p>
+        </w:tc>
+        <w:tc>
+          <w:tcPr/>
+          <w:p>
+            <w:pPr>
+              <w:pStyle w:val="Compact"/>
+            </w:pPr>
+            <w:r>
+              <w:rPr>
+                <w:lang w:val="es-ES"/>
+              </w:rPr>
+              <w:t xml:space="preserve">Una porción significativa a su fundición de Miami, Arizona; el resto se vende como cátodo o concentrado, una parte a su fundición de Atlantic Copper (España). No menciona México</w:t>
+            </w:r>
+          </w:p>
+        </w:tc>
+      </w:tr>
+    </w:tbl>
+    <w:p>
+      <w:pPr>
+        <w:pStyle w:val="BodyText"/>
+      </w:pPr>
+      <w:r>
+        <w:rPr>
+          <w:i/>
+          <w:iCs/>
+          <w:lang w:val="es-ES"/>
+        </w:rPr>
+        <w:t xml:space="preserve">Fuente:</w:t>
+      </w:r>
+      <w:r>
+        <w:rPr>
+          <w:lang w:val="es-ES"/>
+        </w:rPr>
+        <w:t xml:space="preserve"> </w:t>
+      </w:r>
+      <w:r>
+        <w:rPr>
+          <w:lang w:val="es-ES"/>
+        </w:rPr>
+        <w:t xml:space="preserve">Grupo México (2017-2026); Capstone Copper (2021); Mercator Minerals (2012); Freeport-McMoRan (2016, 2025).</w:t>
+      </w:r>
+    </w:p>
+    <w:p>
+      <w:pPr>
+        <w:pStyle w:val="BodyText"/>
+      </w:pPr>
+      <w:r>
+        <w:rPr>
+          <w:lang w:val="es-ES"/>
+        </w:rPr>
+        <w:t xml:space="preserve">Los informes de Grupo México registran, además, que la fundición de Hayden, con capacidad nominal de 653 000 toneladas anuales de concentrado, suspendió actividades en noviembre de 2019, y su informe de 2016 menciona, en la sección de ferrocarriles, a «clientes que exportaban concentrado de cobre por Guaymas».</w:t>
+      </w:r>
+    </w:p>
+    <w:p>
+      <w:pPr>
+        <w:pStyle w:val="BodyText"/>
+      </w:pPr>
+      <w:r>
+        <w:rPr>
+          <w:lang w:val="es-ES"/>
+        </w:rPr>
+        <w:t xml:space="preserve">Los tres hechos describen que una parte del concentrado que Estados Unidos registra como exportación a México no aparece como importación en el registro mexicano, y que los informes de Asarco, Capstone y Mercator describen el envío de concentrado de Arizona al puerto de Guaymas para su venta y embarque. Con los datos disponibles no se puede separar, en toneladas, qué parte del flujo sale por Guaymas hacia terceros países y qué parte se funde en México.</w:t>
       </w:r>
     </w:p>
     <w:bookmarkEnd w:id="28"/>
@@ -6995,7 +7424,7 @@
         <w:rPr>
           <w:lang w:val="es-ES"/>
         </w:rPr>
-        <w:t xml:space="preserve">Las transacciones con Asarco proceden de la nota de partes relacionadas de los 10-K de Southern Copper, que agrupa todos los conceptos sin separar el concentrado. La ruta por Guaymas se documenta con un informe de 2011 (Mercator Minerals) y con información de prensa especializada de fecha incierta cuyo texto completo no se consultó. Faltan los informes de Freeport-McMoRan, Capstone Copper y Grupo México, y las estadísticas de carga del puerto de Guaymas, para separar el tránsito de lo que se funde en México.</w:t>
+        <w:t xml:space="preserve">Las transacciones con Asarco proceden de la nota de partes relacionadas de los 10-K de Southern Copper, que agrupa todos los conceptos sin separar el concentrado. La ruta por Guaymas se documenta con los informes de Grupo México (2022-2025), el reporte técnico de Pinto Valley (2021) y el informe de Mercator Minerals (2011); estos documentos describen la ruta, pero no las toneladas. Las cantidades requieren las estadísticas de carga del puerto de Guaymas (Administración del Sistema Portuario Nacional) o los pedimentos de tránsito internacional, que no se consultaron.</w:t>
       </w:r>
     </w:p>
     <w:p>
@@ -7097,7 +7526,7 @@
         <w:rPr>
           <w:lang w:val="es-ES"/>
         </w:rPr>
-        <w:t xml:space="preserve">Según el registro estadounidense, desde 2013 México es el destino de más de la mitad del concentrado que exporta Estados Unidos. México registra como importación 5 % de ese flujo en 2011-2017 y 43 % en 2018-2024; las compras de Southern Copper a Asarco, que desde 2020 incluyen concentrado, equivalen como máximo a 23 % de esas importaciones en 2020-2024, y la ruta del concentrado de Arizona por Guaymas hacia Asia está documentada para varias minas.</w:t>
+        <w:t xml:space="preserve">Según el registro estadounidense, desde 2013 México es el destino de más de la mitad del concentrado que exporta Estados Unidos. México registra como importación 5 % de ese flujo en 2011-2017 y 43 % en 2018-2024; las compras de Southern Copper a Asarco, que desde 2020 incluyen concentrado, equivalen como máximo a 23 % de esas importaciones en 2020-2024, y los informes de Asarco (2022-2025), Capstone (2021) y Mercator (2011) describen el envío del concentrado de sus minas de Arizona al puerto de Guaymas para su venta y embarque.</w:t>
       </w:r>
     </w:p>
     <w:bookmarkEnd w:id="31"/>
@@ -7142,6 +7571,117 @@
           <w:lang w:val="es-ES"/>
         </w:rPr>
         <w:t xml:space="preserve">. U.S. Geological Survey.</w:t>
+      </w:r>
+    </w:p>
+    <w:p>
+      <w:pPr>
+        <w:pStyle w:val="BodyText"/>
+      </w:pPr>
+      <w:r>
+        <w:rPr>
+          <w:lang w:val="es-ES"/>
+        </w:rPr>
+        <w:t xml:space="preserve">Capstone Copper. (2021).</w:t>
+      </w:r>
+      <w:r>
+        <w:rPr>
+          <w:lang w:val="es-ES"/>
+        </w:rPr>
+        <w:t xml:space="preserve"> </w:t>
+      </w:r>
+      <w:r>
+        <w:rPr>
+          <w:i/>
+          <w:iCs/>
+          <w:lang w:val="es-ES"/>
+        </w:rPr>
+        <w:t xml:space="preserve">NI 43-101 technical report on the Pinto Valley Mine, Arizona, USA</w:t>
+      </w:r>
+      <w:r>
+        <w:rPr>
+          <w:lang w:val="es-ES"/>
+        </w:rPr>
+        <w:t xml:space="preserve"> </w:t>
+      </w:r>
+      <w:r>
+        <w:rPr>
+          <w:lang w:val="es-ES"/>
+        </w:rPr>
+        <w:t xml:space="preserve">(fecha efectiva: 31 de marzo de 2021). https://capstonecopper.com/wp-content/uploads/2023/01/PV3Update_NI-43-101-Technical-Report-Jun-11-2021.pdf</w:t>
+      </w:r>
+    </w:p>
+    <w:p>
+      <w:pPr>
+        <w:pStyle w:val="BodyText"/>
+      </w:pPr>
+      <w:r>
+        <w:rPr>
+          <w:lang w:val="es-ES"/>
+        </w:rPr>
+        <w:t xml:space="preserve">Freeport-McMoRan Inc. (2016, 2025).</w:t>
+      </w:r>
+      <w:r>
+        <w:rPr>
+          <w:lang w:val="es-ES"/>
+        </w:rPr>
+        <w:t xml:space="preserve"> </w:t>
+      </w:r>
+      <w:r>
+        <w:rPr>
+          <w:i/>
+          <w:iCs/>
+          <w:lang w:val="es-ES"/>
+        </w:rPr>
+        <w:t xml:space="preserve">Annual report on Form 10-K</w:t>
+      </w:r>
+      <w:r>
+        <w:rPr>
+          <w:lang w:val="es-ES"/>
+        </w:rPr>
+        <w:t xml:space="preserve"> </w:t>
+      </w:r>
+      <w:r>
+        <w:rPr>
+          <w:lang w:val="es-ES"/>
+        </w:rPr>
+        <w:t xml:space="preserve">(ejercicios 2015 y 2024). U.S. Securities and Exchange Commission.</w:t>
+      </w:r>
+    </w:p>
+    <w:p>
+      <w:pPr>
+        <w:pStyle w:val="BodyText"/>
+      </w:pPr>
+      <w:r>
+        <w:rPr>
+          <w:lang w:val="es-ES"/>
+        </w:rPr>
+        <w:t xml:space="preserve">Grupo México. (2017-2026).</w:t>
+      </w:r>
+      <w:r>
+        <w:rPr>
+          <w:lang w:val="es-ES"/>
+        </w:rPr>
+        <w:t xml:space="preserve"> </w:t>
+      </w:r>
+      <w:r>
+        <w:rPr>
+          <w:i/>
+          <w:iCs/>
+          <w:lang w:val="es-ES"/>
+        </w:rPr>
+        <w:t xml:space="preserve">Informe anual BMV</w:t>
+      </w:r>
+      <w:r>
+        <w:rPr>
+          <w:lang w:val="es-ES"/>
+        </w:rPr>
+        <w:t xml:space="preserve"> </w:t>
+      </w:r>
+      <w:r>
+        <w:rPr>
+          <w:lang w:val="es-ES"/>
+        </w:rPr>
+        <w:t xml:space="preserve">(ejercicios 2016 a 2025). https://www.gmexico.com/reportes-financieros/</w:t>
       </w:r>
     </w:p>
     <w:p>

</xml_diff>

<commit_message>
Pregunta A: estadística del puerto de Guaymas
Anuarios por puerto de la DGPMM (2020 y 2022): el concentrado de cobre
embarcado en Guaymas supera la exportación nacional en al menos 119 598 y
224 129 t; ASIPONA registra concentrado en tránsito internacional desde el sur
de EUA hacia Asia. Cuadro 8 en el escrito independiente.

Co-Authored-By: Claude Opus 5.5 <noreply@anthropic.com>
</commit_message>
<xml_diff>
--- a/ICR/11 Redaccion/Escritos independientes/Mexico y el abasto de cobre de Estados Unidos, 1992-2024.docx
+++ b/ICR/11 Redaccion/Escritos independientes/Mexico y el abasto de cobre de Estados Unidos, 1992-2024.docx
@@ -358,6 +358,35 @@
           <w:lang w:val="es-ES"/>
         </w:rPr>
         <w:t xml:space="preserve">La nota de operaciones con partes relacionadas de los informes anuales 10-K de Southern Copper Corporation, 2015-2025 (Southern Copper Corporation, 2016-2026); la descripción de las operaciones de Asarco en los informes anuales de Grupo México a la Bolsa Mexicana de Valores, 2016-2025 (Grupo México, 2017-2026); el reporte técnico de la mina Pinto Valley (Capstone Copper, 2021); los informes 10-K de Freeport-McMoRan de 2015 y 2024 (Freeport-McMoRan, 2016, 2025); y el análisis de la administración de Mercator Minerals para 2011 (Mercator Minerals, 2012).</w:t>
+      </w:r>
+    </w:p>
+    <w:p>
+      <w:pPr>
+        <w:pStyle w:val="Compact"/>
+        <w:numPr>
+          <w:ilvl w:val="0"/>
+          <w:numId w:val="1001"/>
+        </w:numPr>
+      </w:pPr>
+      <w:r>
+        <w:rPr>
+          <w:b/>
+          <w:bCs/>
+          <w:lang w:val="es-ES"/>
+        </w:rPr>
+        <w:t xml:space="preserve">Estadística portuaria.</w:t>
+      </w:r>
+      <w:r>
+        <w:rPr>
+          <w:lang w:val="es-ES"/>
+        </w:rPr>
+        <w:t xml:space="preserve"> </w:t>
+      </w:r>
+      <w:r>
+        <w:rPr>
+          <w:lang w:val="es-ES"/>
+        </w:rPr>
+        <w:t xml:space="preserve">Los anuarios por puerto de la Dirección General de Puertos para Guaymas, ediciones 2020 y 2022, que desglosan la exportación por producto y país de destino (Dirección General de Puertos, s.f.-a, s.f.-b), y los informes de la Administración del Sistema Portuario Nacional (ASIPONA) Guaymas sobre 2023 y 2024 (ASIPONA Guaymas, s.f.-a, s.f.-b).</w:t>
       </w:r>
     </w:p>
     <w:bookmarkEnd w:id="10"/>
@@ -6627,7 +6656,7 @@
         <w:rPr>
           <w:lang w:val="es-ES"/>
         </w:rPr>
-        <w:t xml:space="preserve">Tres hechos describen la composición de ese flujo.</w:t>
+        <w:t xml:space="preserve">Cuatro hechos describen la composición de ese flujo.</w:t>
       </w:r>
     </w:p>
     <w:p>
@@ -7100,7 +7129,325 @@
         <w:rPr>
           <w:lang w:val="es-ES"/>
         </w:rPr>
-        <w:t xml:space="preserve">Los tres hechos describen que una parte del concentrado que Estados Unidos registra como exportación a México no aparece como importación en el registro mexicano, y que los informes de Asarco, Capstone y Mercator describen el envío de concentrado de Arizona al puerto de Guaymas para su venta y embarque. Con los datos disponibles no se puede separar, en toneladas, qué parte del flujo sale por Guaymas hacia terceros países y qué parte se funde en México.</w:t>
+        <w:t xml:space="preserve">Cuarto, la estadística del puerto de Guaymas registra el concentrado de cobre embarcado (Cuadro 8). En 2020 salieron por Guaymas 1 936 259 toneladas de concentrado de cobre, 119 598 más que el total de concentrado que México declaró exportar ese año por todas sus aduanas (1 816 661 toneladas); en 2022, 1 791 125 toneladas, 224 129 más que el total nacional (1 566 996). Si todo el concentrado mexicano exportado saliera por Guaymas, esa diferencia sería la parte embarcada en el puerto que no es exportación mexicana; por eso es una cota inferior. Los destinos de ese concentrado fueron China (79 % en 2020; 63 % en 2022), Japón (7 % y 26 %), España, Filipinas, Perú y otros países en proporciones menores.</w:t>
+      </w:r>
+    </w:p>
+    <w:p>
+      <w:pPr>
+        <w:pStyle w:val="BodyText"/>
+      </w:pPr>
+      <w:r>
+        <w:rPr>
+          <w:b/>
+          <w:bCs/>
+          <w:lang w:val="es-ES"/>
+        </w:rPr>
+        <w:t xml:space="preserve">Cuadro 8.</w:t>
+      </w:r>
+      <w:r>
+        <w:rPr>
+          <w:lang w:val="es-ES"/>
+        </w:rPr>
+        <w:t xml:space="preserve"> </w:t>
+      </w:r>
+      <w:r>
+        <w:rPr>
+          <w:lang w:val="es-ES"/>
+        </w:rPr>
+        <w:t xml:space="preserve">Concentrado de cobre embarcado en el puerto de Guaymas y exportación nacional de concentrado de México, 2020 y 2022 (toneladas)</w:t>
+      </w:r>
+    </w:p>
+    <w:tbl>
+      <w:tblPr>
+        <w:tblStyle w:val="Table"/>
+        <w:tblW w:type="pct" w:w="5000"/>
+        <w:tblLayout w:type="fixed"/>
+        <w:tblLook w:firstRow="1" w:lastRow="0" w:firstColumn="0" w:lastColumn="0" w:noHBand="0" w:noVBand="0" w:val="0020"/>
+      </w:tblPr>
+      <w:tblGrid>
+        <w:gridCol w:w="1250"/>
+        <w:gridCol w:w="1667"/>
+        <w:gridCol w:w="1667"/>
+        <w:gridCol w:w="1667"/>
+        <w:gridCol w:w="1667"/>
+      </w:tblGrid>
+      <w:tr>
+        <w:trPr>
+          <w:tblHeader w:val="on"/>
+        </w:trPr>
+        <w:tc>
+          <w:tcPr/>
+          <w:p>
+            <w:pPr>
+              <w:pStyle w:val="Compact"/>
+            </w:pPr>
+            <w:r>
+              <w:rPr>
+                <w:lang w:val="es-ES"/>
+              </w:rPr>
+              <w:t xml:space="preserve">Año</w:t>
+            </w:r>
+          </w:p>
+        </w:tc>
+        <w:tc>
+          <w:tcPr/>
+          <w:p>
+            <w:pPr>
+              <w:pStyle w:val="Compact"/>
+              <w:jc w:val="right"/>
+            </w:pPr>
+            <w:r>
+              <w:rPr>
+                <w:lang w:val="es-ES"/>
+              </w:rPr>
+              <w:t xml:space="preserve">Embarcado en Guaymas</w:t>
+            </w:r>
+          </w:p>
+        </w:tc>
+        <w:tc>
+          <w:tcPr/>
+          <w:p>
+            <w:pPr>
+              <w:pStyle w:val="Compact"/>
+              <w:jc w:val="right"/>
+            </w:pPr>
+            <w:r>
+              <w:rPr>
+                <w:lang w:val="es-ES"/>
+              </w:rPr>
+              <w:t xml:space="preserve">Exportación nacional de México (todas las aduanas)</w:t>
+            </w:r>
+          </w:p>
+        </w:tc>
+        <w:tc>
+          <w:tcPr/>
+          <w:p>
+            <w:pPr>
+              <w:pStyle w:val="Compact"/>
+              <w:jc w:val="right"/>
+            </w:pPr>
+            <w:r>
+              <w:rPr>
+                <w:lang w:val="es-ES"/>
+              </w:rPr>
+              <w:t xml:space="preserve">Diferencia (cota inferior de lo no mexicano)</w:t>
+            </w:r>
+          </w:p>
+        </w:tc>
+        <w:tc>
+          <w:tcPr/>
+          <w:p>
+            <w:pPr>
+              <w:pStyle w:val="Compact"/>
+              <w:jc w:val="right"/>
+            </w:pPr>
+            <w:r>
+              <w:rPr>
+                <w:lang w:val="es-ES"/>
+              </w:rPr>
+              <w:t xml:space="preserve">% del embarcado</w:t>
+            </w:r>
+          </w:p>
+        </w:tc>
+      </w:tr>
+      <w:tr>
+        <w:tc>
+          <w:tcPr/>
+          <w:p>
+            <w:pPr>
+              <w:pStyle w:val="Compact"/>
+            </w:pPr>
+            <w:r>
+              <w:rPr>
+                <w:lang w:val="es-ES"/>
+              </w:rPr>
+              <w:t xml:space="preserve">2020</w:t>
+            </w:r>
+          </w:p>
+        </w:tc>
+        <w:tc>
+          <w:tcPr/>
+          <w:p>
+            <w:pPr>
+              <w:pStyle w:val="Compact"/>
+              <w:jc w:val="right"/>
+            </w:pPr>
+            <w:r>
+              <w:rPr>
+                <w:lang w:val="es-ES"/>
+              </w:rPr>
+              <w:t xml:space="preserve">1 936 259</w:t>
+            </w:r>
+          </w:p>
+        </w:tc>
+        <w:tc>
+          <w:tcPr/>
+          <w:p>
+            <w:pPr>
+              <w:pStyle w:val="Compact"/>
+              <w:jc w:val="right"/>
+            </w:pPr>
+            <w:r>
+              <w:rPr>
+                <w:lang w:val="es-ES"/>
+              </w:rPr>
+              <w:t xml:space="preserve">1 816 661</w:t>
+            </w:r>
+          </w:p>
+        </w:tc>
+        <w:tc>
+          <w:tcPr/>
+          <w:p>
+            <w:pPr>
+              <w:pStyle w:val="Compact"/>
+              <w:jc w:val="right"/>
+            </w:pPr>
+            <w:r>
+              <w:rPr>
+                <w:lang w:val="es-ES"/>
+              </w:rPr>
+              <w:t xml:space="preserve">119 598</w:t>
+            </w:r>
+          </w:p>
+        </w:tc>
+        <w:tc>
+          <w:tcPr/>
+          <w:p>
+            <w:pPr>
+              <w:pStyle w:val="Compact"/>
+              <w:jc w:val="right"/>
+            </w:pPr>
+            <w:r>
+              <w:rPr>
+                <w:lang w:val="es-ES"/>
+              </w:rPr>
+              <w:t xml:space="preserve">6.2</w:t>
+            </w:r>
+          </w:p>
+        </w:tc>
+      </w:tr>
+      <w:tr>
+        <w:tc>
+          <w:tcPr/>
+          <w:p>
+            <w:pPr>
+              <w:pStyle w:val="Compact"/>
+            </w:pPr>
+            <w:r>
+              <w:rPr>
+                <w:lang w:val="es-ES"/>
+              </w:rPr>
+              <w:t xml:space="preserve">2022</w:t>
+            </w:r>
+          </w:p>
+        </w:tc>
+        <w:tc>
+          <w:tcPr/>
+          <w:p>
+            <w:pPr>
+              <w:pStyle w:val="Compact"/>
+              <w:jc w:val="right"/>
+            </w:pPr>
+            <w:r>
+              <w:rPr>
+                <w:lang w:val="es-ES"/>
+              </w:rPr>
+              <w:t xml:space="preserve">1 791 125</w:t>
+            </w:r>
+          </w:p>
+        </w:tc>
+        <w:tc>
+          <w:tcPr/>
+          <w:p>
+            <w:pPr>
+              <w:pStyle w:val="Compact"/>
+              <w:jc w:val="right"/>
+            </w:pPr>
+            <w:r>
+              <w:rPr>
+                <w:lang w:val="es-ES"/>
+              </w:rPr>
+              <w:t xml:space="preserve">1 566 996</w:t>
+            </w:r>
+          </w:p>
+        </w:tc>
+        <w:tc>
+          <w:tcPr/>
+          <w:p>
+            <w:pPr>
+              <w:pStyle w:val="Compact"/>
+              <w:jc w:val="right"/>
+            </w:pPr>
+            <w:r>
+              <w:rPr>
+                <w:lang w:val="es-ES"/>
+              </w:rPr>
+              <w:t xml:space="preserve">224 129</w:t>
+            </w:r>
+          </w:p>
+        </w:tc>
+        <w:tc>
+          <w:tcPr/>
+          <w:p>
+            <w:pPr>
+              <w:pStyle w:val="Compact"/>
+              <w:jc w:val="right"/>
+            </w:pPr>
+            <w:r>
+              <w:rPr>
+                <w:lang w:val="es-ES"/>
+              </w:rPr>
+              <w:t xml:space="preserve">12.5</w:t>
+            </w:r>
+          </w:p>
+        </w:tc>
+      </w:tr>
+    </w:tbl>
+    <w:p>
+      <w:pPr>
+        <w:pStyle w:val="BodyText"/>
+      </w:pPr>
+      <w:r>
+        <w:rPr>
+          <w:i/>
+          <w:iCs/>
+          <w:lang w:val="es-ES"/>
+        </w:rPr>
+        <w:t xml:space="preserve">Fuente:</w:t>
+      </w:r>
+      <w:r>
+        <w:rPr>
+          <w:lang w:val="es-ES"/>
+        </w:rPr>
+        <w:t xml:space="preserve"> </w:t>
+      </w:r>
+      <w:r>
+        <w:rPr>
+          <w:lang w:val="es-ES"/>
+        </w:rPr>
+        <w:t xml:space="preserve">Dirección General de Puertos (s.f.-a, s.f.-b); cálculo propio con datos de Naciones Unidas (2026).</w:t>
+      </w:r>
+    </w:p>
+    <w:p>
+      <w:pPr>
+        <w:pStyle w:val="BodyText"/>
+      </w:pPr>
+      <w:r>
+        <w:rPr>
+          <w:lang w:val="es-ES"/>
+        </w:rPr>
+        <w:t xml:space="preserve">La administración del puerto describe, además, el origen de una parte de ese movimiento. En su informe sobre 2023 señala que el granel mineral, 58 % de la carga del puerto, consistió «principalmente [en] concentrados de cobre de exportación y tránsito internacional»; en el de 2024 registra que «el concentrado de cobre en tránsito internacional proveniente del sur de los Estados Unidos con destino hacia Asia presentó una baja del 68 %», y lo atribuye a que ese concentrado se consumió en el mercado estadounidense (ASIPONA Guaymas, s.f.-a). En 2024 la carga comercial del puerto en tránsito internacional sumó 135 566 toneladas de todos los productos (ASIPONA Guaymas, s.f.-b).</w:t>
+      </w:r>
+    </w:p>
+    <w:p>
+      <w:pPr>
+        <w:pStyle w:val="BodyText"/>
+      </w:pPr>
+      <w:r>
+        <w:rPr>
+          <w:lang w:val="es-ES"/>
+        </w:rPr>
+        <w:t xml:space="preserve">Los cuatro hechos describen que una parte del concentrado que Estados Unidos registra como exportación a México no aparece como importación en el registro mexicano; que los informes de Asarco, Capstone y Mercator describen el envío de concentrado de Arizona al puerto de Guaymas para su venta y embarque; y que la estadística del puerto registra concentrado de cobre en tránsito internacional desde el sur de Estados Unidos hacia Asia, con un volumen embarcado que en 2020 y 2022 supera en al menos 120 000 y 224 000 toneladas la exportación nacional de concentrado.</w:t>
       </w:r>
     </w:p>
     <w:bookmarkEnd w:id="28"/>
@@ -7424,7 +7771,7 @@
         <w:rPr>
           <w:lang w:val="es-ES"/>
         </w:rPr>
-        <w:t xml:space="preserve">Las transacciones con Asarco proceden de la nota de partes relacionadas de los 10-K de Southern Copper, que agrupa todos los conceptos sin separar el concentrado. La ruta por Guaymas se documenta con los informes de Grupo México (2022-2025), el reporte técnico de Pinto Valley (2021) y el informe de Mercator Minerals (2011); estos documentos describen la ruta, pero no las toneladas. Las cantidades requieren las estadísticas de carga del puerto de Guaymas (Administración del Sistema Portuario Nacional) o los pedimentos de tránsito internacional, que no se consultaron.</w:t>
+        <w:t xml:space="preserve">Las transacciones con Asarco proceden de la nota de partes relacionadas de los 10-K de Southern Copper, que agrupa todos los conceptos sin separar el concentrado. La ruta por Guaymas se documenta con los informes de Grupo México (2022-2025), el reporte técnico de Pinto Valley (2021) y el informe de Mercator Minerals (2011); estos documentos describen la ruta, pero no las toneladas. La estadística portuaria con desglose por producto se obtuvo solo para 2020 y 2022, y no separa el tránsito internacional dentro de la exportación de concentrado; la diferencia del Cuadro 8 es una cota inferior, porque supone que todo el concentrado mexicano exportado sale por Guaymas. Medir el tránsito completo requiere los pedimentos de tránsito internacional de la aduana de Guaymas o la serie de ASIPONA por tipo de tráfico y producto.</w:t>
       </w:r>
     </w:p>
     <w:p>
@@ -7526,7 +7873,7 @@
         <w:rPr>
           <w:lang w:val="es-ES"/>
         </w:rPr>
-        <w:t xml:space="preserve">Según el registro estadounidense, desde 2013 México es el destino de más de la mitad del concentrado que exporta Estados Unidos. México registra como importación 5 % de ese flujo en 2011-2017 y 43 % en 2018-2024; las compras de Southern Copper a Asarco, que desde 2020 incluyen concentrado, equivalen como máximo a 23 % de esas importaciones en 2020-2024, y los informes de Asarco (2022-2025), Capstone (2021) y Mercator (2011) describen el envío del concentrado de sus minas de Arizona al puerto de Guaymas para su venta y embarque.</w:t>
+        <w:t xml:space="preserve">Según el registro estadounidense, desde 2013 México es el destino de más de la mitad del concentrado que exporta Estados Unidos. México registra como importación 5 % de ese flujo en 2011-2017 y 43 % en 2018-2024; las compras de Southern Copper a Asarco, que desde 2020 incluyen concentrado, equivalen como máximo a 23 % de esas importaciones en 2020-2024, los informes de Asarco (2022-2025), Capstone (2021) y Mercator (2011) describen el envío del concentrado de sus minas de Arizona al puerto de Guaymas para su venta y embarque, y la administración del puerto registra concentrado de cobre en tránsito internacional desde el sur de Estados Unidos hacia Asia; en 2020 y 2022 el concentrado embarcado en Guaymas superó la exportación nacional de concentrado en al menos 120 000 y 224 000 toneladas.</w:t>
       </w:r>
     </w:p>
     <w:bookmarkEnd w:id="31"/>
@@ -7581,7 +7928,7 @@
         <w:rPr>
           <w:lang w:val="es-ES"/>
         </w:rPr>
-        <w:t xml:space="preserve">Capstone Copper. (2021).</w:t>
+        <w:t xml:space="preserve">Administración del Sistema Portuario Nacional Guaymas. (s.f.-a).</w:t>
       </w:r>
       <w:r>
         <w:rPr>
@@ -7595,6 +7942,68 @@
           <w:iCs/>
           <w:lang w:val="es-ES"/>
         </w:rPr>
+        <w:t xml:space="preserve">Avances y resultados 2023-2024. Programa institucional 2020-2024</w:t>
+      </w:r>
+      <w:r>
+        <w:rPr>
+          <w:lang w:val="es-ES"/>
+        </w:rPr>
+        <w:t xml:space="preserve">. https://puertodeguaymas.com.mx/Documentos/transparencia/2023_ASIPONA_GUAYMAS_Avances_y_Resultados.pdf</w:t>
+      </w:r>
+    </w:p>
+    <w:p>
+      <w:pPr>
+        <w:pStyle w:val="BodyText"/>
+      </w:pPr>
+      <w:r>
+        <w:rPr>
+          <w:lang w:val="es-ES"/>
+        </w:rPr>
+        <w:t xml:space="preserve">Administración del Sistema Portuario Nacional Guaymas. (s.f.-b).</w:t>
+      </w:r>
+      <w:r>
+        <w:rPr>
+          <w:lang w:val="es-ES"/>
+        </w:rPr>
+        <w:t xml:space="preserve"> </w:t>
+      </w:r>
+      <w:r>
+        <w:rPr>
+          <w:i/>
+          <w:iCs/>
+          <w:lang w:val="es-ES"/>
+        </w:rPr>
+        <w:t xml:space="preserve">Estadística cierre diciembre 2024</w:t>
+      </w:r>
+      <w:r>
+        <w:rPr>
+          <w:lang w:val="es-ES"/>
+        </w:rPr>
+        <w:t xml:space="preserve">. https://www.puertodeguaymas.com.mx/descargas/estadisticas/2023_Cargatotal.pdf</w:t>
+      </w:r>
+    </w:p>
+    <w:p>
+      <w:pPr>
+        <w:pStyle w:val="BodyText"/>
+      </w:pPr>
+      <w:r>
+        <w:rPr>
+          <w:lang w:val="es-ES"/>
+        </w:rPr>
+        <w:t xml:space="preserve">Capstone Copper. (2021).</w:t>
+      </w:r>
+      <w:r>
+        <w:rPr>
+          <w:lang w:val="es-ES"/>
+        </w:rPr>
+        <w:t xml:space="preserve"> </w:t>
+      </w:r>
+      <w:r>
+        <w:rPr>
+          <w:i/>
+          <w:iCs/>
+          <w:lang w:val="es-ES"/>
+        </w:rPr>
         <w:t xml:space="preserve">NI 43-101 technical report on the Pinto Valley Mine, Arizona, USA</w:t>
       </w:r>
       <w:r>
@@ -7608,6 +8017,80 @@
           <w:lang w:val="es-ES"/>
         </w:rPr>
         <w:t xml:space="preserve">(fecha efectiva: 31 de marzo de 2021). https://capstonecopper.com/wp-content/uploads/2023/01/PV3Update_NI-43-101-Technical-Report-Jun-11-2021.pdf</w:t>
+      </w:r>
+    </w:p>
+    <w:p>
+      <w:pPr>
+        <w:pStyle w:val="BodyText"/>
+      </w:pPr>
+      <w:r>
+        <w:rPr>
+          <w:lang w:val="es-ES"/>
+        </w:rPr>
+        <w:t xml:space="preserve">Dirección General de Puertos. (s.f.-a).</w:t>
+      </w:r>
+      <w:r>
+        <w:rPr>
+          <w:lang w:val="es-ES"/>
+        </w:rPr>
+        <w:t xml:space="preserve"> </w:t>
+      </w:r>
+      <w:r>
+        <w:rPr>
+          <w:i/>
+          <w:iCs/>
+          <w:lang w:val="es-ES"/>
+        </w:rPr>
+        <w:t xml:space="preserve">Guaymas, Son.: movimiento de carga, 2020</w:t>
+      </w:r>
+      <w:r>
+        <w:rPr>
+          <w:lang w:val="es-ES"/>
+        </w:rPr>
+        <w:t xml:space="preserve"> </w:t>
+      </w:r>
+      <w:r>
+        <w:rPr>
+          <w:lang w:val="es-ES"/>
+        </w:rPr>
+        <w:t xml:space="preserve">[anuario estadístico por puerto]. Secretaría de Marina. https://www.gob.mx/cms/uploads/attachment/file/765592/PASOGU00.pdf</w:t>
+      </w:r>
+    </w:p>
+    <w:p>
+      <w:pPr>
+        <w:pStyle w:val="BodyText"/>
+      </w:pPr>
+      <w:r>
+        <w:rPr>
+          <w:lang w:val="es-ES"/>
+        </w:rPr>
+        <w:t xml:space="preserve">Dirección General de Puertos. (s.f.-b).</w:t>
+      </w:r>
+      <w:r>
+        <w:rPr>
+          <w:lang w:val="es-ES"/>
+        </w:rPr>
+        <w:t xml:space="preserve"> </w:t>
+      </w:r>
+      <w:r>
+        <w:rPr>
+          <w:i/>
+          <w:iCs/>
+          <w:lang w:val="es-ES"/>
+        </w:rPr>
+        <w:t xml:space="preserve">Guaymas, Son.: movimiento de carga, 2022</w:t>
+      </w:r>
+      <w:r>
+        <w:rPr>
+          <w:lang w:val="es-ES"/>
+        </w:rPr>
+        <w:t xml:space="preserve"> </w:t>
+      </w:r>
+      <w:r>
+        <w:rPr>
+          <w:lang w:val="es-ES"/>
+        </w:rPr>
+        <w:t xml:space="preserve">[anuario estadístico por puerto]. Secretaría de Marina. https://www.gob.mx/cms/uploads/attachment/file/903623/PASOGU00-1.pdf</w:t>
       </w:r>
     </w:p>
     <w:p>

</xml_diff>